<commit_message>
Improve Word conference layout using template dimensions
</commit_message>
<xml_diff>
--- a/submission/relay_uas_aeroconf.docx
+++ b/submission/relay_uas_aeroconf.docx
@@ -139,7 +139,7 @@
       <w:r>
         <w:fldChar w:fldCharType="separate"/>
       </w:r>
-      <w:hyperlink w:anchor="_Toc241054955" w:history="1">
+      <w:hyperlink w:anchor="_Toc241065241" w:history="1">
         <w:r>
           <w:rPr>
             <w:rStyle w:val="Hyperlink"/>
@@ -166,7 +166,7 @@
             <w:noProof/>
             <w:webHidden/>
           </w:rPr>
-          <w:instrText xml:space="preserve"> PAGEREF _Toc241054955 \h </w:instrText>
+          <w:instrText xml:space="preserve"> PAGEREF _Toc241065241 \h </w:instrText>
         </w:r>
         <w:r>
           <w:rPr>
@@ -213,7 +213,7 @@
           <w14:ligatures w14:val="standardContextual"/>
         </w:rPr>
       </w:pPr>
-      <w:hyperlink w:anchor="_Toc241054956" w:history="1">
+      <w:hyperlink w:anchor="_Toc241065242" w:history="1">
         <w:r>
           <w:rPr>
             <w:rStyle w:val="Hyperlink"/>
@@ -240,7 +240,7 @@
             <w:noProof/>
             <w:webHidden/>
           </w:rPr>
-          <w:instrText xml:space="preserve"> PAGEREF _Toc241054956 \h </w:instrText>
+          <w:instrText xml:space="preserve"> PAGEREF _Toc241065242 \h </w:instrText>
         </w:r>
         <w:r>
           <w:rPr>
@@ -287,7 +287,7 @@
           <w14:ligatures w14:val="standardContextual"/>
         </w:rPr>
       </w:pPr>
-      <w:hyperlink w:anchor="_Toc241054957" w:history="1">
+      <w:hyperlink w:anchor="_Toc241065243" w:history="1">
         <w:r>
           <w:rPr>
             <w:rStyle w:val="Hyperlink"/>
@@ -314,7 +314,7 @@
             <w:noProof/>
             <w:webHidden/>
           </w:rPr>
-          <w:instrText xml:space="preserve"> PAGEREF _Toc241054957 \h </w:instrText>
+          <w:instrText xml:space="preserve"> PAGEREF _Toc241065243 \h </w:instrText>
         </w:r>
         <w:r>
           <w:rPr>
@@ -361,7 +361,7 @@
           <w14:ligatures w14:val="standardContextual"/>
         </w:rPr>
       </w:pPr>
-      <w:hyperlink w:anchor="_Toc241054958" w:history="1">
+      <w:hyperlink w:anchor="_Toc241065244" w:history="1">
         <w:r>
           <w:rPr>
             <w:rStyle w:val="Hyperlink"/>
@@ -388,7 +388,7 @@
             <w:noProof/>
             <w:webHidden/>
           </w:rPr>
-          <w:instrText xml:space="preserve"> PAGEREF _Toc241054958 \h </w:instrText>
+          <w:instrText xml:space="preserve"> PAGEREF _Toc241065244 \h </w:instrText>
         </w:r>
         <w:r>
           <w:rPr>
@@ -408,7 +408,7 @@
             <w:noProof/>
             <w:webHidden/>
           </w:rPr>
-          <w:t>9</w:t>
+          <w:t>8</w:t>
         </w:r>
         <w:r>
           <w:rPr>
@@ -435,7 +435,7 @@
           <w14:ligatures w14:val="standardContextual"/>
         </w:rPr>
       </w:pPr>
-      <w:hyperlink w:anchor="_Toc241054959" w:history="1">
+      <w:hyperlink w:anchor="_Toc241065245" w:history="1">
         <w:r>
           <w:rPr>
             <w:rStyle w:val="Hyperlink"/>
@@ -462,7 +462,7 @@
             <w:noProof/>
             <w:webHidden/>
           </w:rPr>
-          <w:instrText xml:space="preserve"> PAGEREF _Toc241054959 \h </w:instrText>
+          <w:instrText xml:space="preserve"> PAGEREF _Toc241065245 \h </w:instrText>
         </w:r>
         <w:r>
           <w:rPr>
@@ -509,7 +509,7 @@
           <w14:ligatures w14:val="standardContextual"/>
         </w:rPr>
       </w:pPr>
-      <w:hyperlink w:anchor="_Toc241054960" w:history="1">
+      <w:hyperlink w:anchor="_Toc241065246" w:history="1">
         <w:r>
           <w:rPr>
             <w:rStyle w:val="Hyperlink"/>
@@ -536,7 +536,7 @@
             <w:noProof/>
             <w:webHidden/>
           </w:rPr>
-          <w:instrText xml:space="preserve"> PAGEREF _Toc241054960 \h </w:instrText>
+          <w:instrText xml:space="preserve"> PAGEREF _Toc241065246 \h </w:instrText>
         </w:r>
         <w:r>
           <w:rPr>
@@ -583,7 +583,7 @@
           <w14:ligatures w14:val="standardContextual"/>
         </w:rPr>
       </w:pPr>
-      <w:hyperlink w:anchor="_Toc241054961" w:history="1">
+      <w:hyperlink w:anchor="_Toc241065247" w:history="1">
         <w:r>
           <w:rPr>
             <w:rStyle w:val="Hyperlink"/>
@@ -610,7 +610,7 @@
             <w:noProof/>
             <w:webHidden/>
           </w:rPr>
-          <w:instrText xml:space="preserve"> PAGEREF _Toc241054961 \h </w:instrText>
+          <w:instrText xml:space="preserve"> PAGEREF _Toc241065247 \h </w:instrText>
         </w:r>
         <w:r>
           <w:rPr>
@@ -657,7 +657,7 @@
           <w14:ligatures w14:val="standardContextual"/>
         </w:rPr>
       </w:pPr>
-      <w:hyperlink w:anchor="_Toc241054962" w:history="1">
+      <w:hyperlink w:anchor="_Toc241065248" w:history="1">
         <w:r>
           <w:rPr>
             <w:rStyle w:val="Hyperlink"/>
@@ -684,7 +684,7 @@
             <w:noProof/>
             <w:webHidden/>
           </w:rPr>
-          <w:instrText xml:space="preserve"> PAGEREF _Toc241054962 \h </w:instrText>
+          <w:instrText xml:space="preserve"> PAGEREF _Toc241065248 \h </w:instrText>
         </w:r>
         <w:r>
           <w:rPr>
@@ -731,7 +731,7 @@
           <w14:ligatures w14:val="standardContextual"/>
         </w:rPr>
       </w:pPr>
-      <w:hyperlink w:anchor="_Toc241054963" w:history="1">
+      <w:hyperlink w:anchor="_Toc241065249" w:history="1">
         <w:r>
           <w:rPr>
             <w:rStyle w:val="Hyperlink"/>
@@ -758,7 +758,7 @@
             <w:noProof/>
             <w:webHidden/>
           </w:rPr>
-          <w:instrText xml:space="preserve"> PAGEREF _Toc241054963 \h </w:instrText>
+          <w:instrText xml:space="preserve"> PAGEREF _Toc241065249 \h </w:instrText>
         </w:r>
         <w:r>
           <w:rPr>
@@ -805,7 +805,7 @@
           <w14:ligatures w14:val="standardContextual"/>
         </w:rPr>
       </w:pPr>
-      <w:hyperlink w:anchor="_Toc241054964" w:history="1">
+      <w:hyperlink w:anchor="_Toc241065250" w:history="1">
         <w:r>
           <w:rPr>
             <w:rStyle w:val="Hyperlink"/>
@@ -832,7 +832,7 @@
             <w:noProof/>
             <w:webHidden/>
           </w:rPr>
-          <w:instrText xml:space="preserve"> PAGEREF _Toc241054964 \h </w:instrText>
+          <w:instrText xml:space="preserve"> PAGEREF _Toc241065250 \h </w:instrText>
         </w:r>
         <w:r>
           <w:rPr>
@@ -879,7 +879,7 @@
           <w14:ligatures w14:val="standardContextual"/>
         </w:rPr>
       </w:pPr>
-      <w:hyperlink w:anchor="_Toc241054965" w:history="1">
+      <w:hyperlink w:anchor="_Toc241065251" w:history="1">
         <w:r>
           <w:rPr>
             <w:rStyle w:val="Hyperlink"/>
@@ -906,7 +906,7 @@
             <w:noProof/>
             <w:webHidden/>
           </w:rPr>
-          <w:instrText xml:space="preserve"> PAGEREF _Toc241054965 \h </w:instrText>
+          <w:instrText xml:space="preserve"> PAGEREF _Toc241065251 \h </w:instrText>
         </w:r>
         <w:r>
           <w:rPr>
@@ -947,7 +947,7 @@
         <w:pStyle w:val="Heading1"/>
       </w:pPr>
       <w:bookmarkStart w:id="1" w:name="introduction"/>
-      <w:bookmarkStart w:id="2" w:name="_Toc241054955"/>
+      <w:bookmarkStart w:id="2" w:name="_Toc241065241"/>
       <w:bookmarkEnd w:id="0"/>
       <w:r>
         <w:t>1. Introduction</w:t>
@@ -1474,7 +1474,7 @@
         <w:pStyle w:val="Heading1"/>
       </w:pPr>
       <w:bookmarkStart w:id="4" w:name="system-and-assessment-boundary"/>
-      <w:bookmarkStart w:id="5" w:name="_Toc241054956"/>
+      <w:bookmarkStart w:id="5" w:name="_Toc241065242"/>
       <w:bookmarkEnd w:id="1"/>
       <w:bookmarkEnd w:id="3"/>
       <w:r>
@@ -1550,7 +1550,7 @@
         </w:rPr>
         <w:lastRenderedPageBreak/>
         <w:drawing>
-          <wp:inline distT="0" distB="0" distL="0" distR="0" wp14:anchorId="03B06C53" wp14:editId="03B06C54">
+          <wp:inline distT="0" distB="0" distL="0" distR="0" wp14:anchorId="1DF1864D" wp14:editId="55BA0C1E">
             <wp:extent cx="6400800" cy="4335031"/>
             <wp:effectExtent l="0" t="0" r="0" b="0"/>
             <wp:docPr id="1" name="Picture 1"/>
@@ -1615,7 +1615,7 @@
         <w:pStyle w:val="Heading1"/>
       </w:pPr>
       <w:bookmarkStart w:id="6" w:name="method"/>
-      <w:bookmarkStart w:id="7" w:name="_Toc241054957"/>
+      <w:bookmarkStart w:id="7" w:name="_Toc241065243"/>
       <w:bookmarkEnd w:id="4"/>
       <w:r>
         <w:t>3. Method</w:t>
@@ -7640,7 +7640,7 @@
         </w:rPr>
         <w:lastRenderedPageBreak/>
         <w:drawing>
-          <wp:inline distT="0" distB="0" distL="0" distR="0" wp14:anchorId="03B06C55" wp14:editId="03B06C56">
+          <wp:inline distT="0" distB="0" distL="0" distR="0" wp14:anchorId="5D6FB410" wp14:editId="215BA980">
             <wp:extent cx="6400800" cy="2601980"/>
             <wp:effectExtent l="0" t="0" r="0" b="0"/>
             <wp:docPr id="2" name="Picture 2"/>
@@ -7707,6 +7707,7 @@
       <w:bookmarkStart w:id="13" w:name="size-limits-and-decision-order"/>
       <w:bookmarkEnd w:id="12"/>
       <w:r>
+        <w:lastRenderedPageBreak/>
         <w:t>Size Limits and Decision Order</w:t>
       </w:r>
     </w:p>
@@ -7868,10 +7869,10 @@
         <w:jc w:val="both"/>
       </w:pPr>
       <w:r>
-        <w:t xml:space="preserve">Each case then receives one label from the first check that fails. If the direct path passes the assumed service screen, the case is direct: relay benefit is not required by this criterion. Otherwise, if either relay hop is blocked or short of margin, the case is link fail. Otherwise, if the aircraft has no solution, the case is no solution, and if it has a solution outside the size limits, the case is too large. What remains is a pass, meaning a blocked or insufficient direct path, two </w:t>
-      </w:r>
-      <w:r>
-        <w:t>passing outbound relay hops, and a finite carrier within the exploratory limits. Because connectivity is checked first, a link fail label can hide an aircraft failure in the same case, so the case records keep both flags.</w:t>
+        <w:t>Each case then receives one label from the first check that fails. If the direct path passes the assumed service screen, the case is direct: relay benefit is not required by this criterion. Otherwise, if either relay hop is blocked or short of margin, the case is link fail. Otherwise, if the aircraft has no solution, the case is no solution, and if it has a solution outside the size limits, the case is too large. What remains is a pass, meaning a blocked or insufficient direct path, two passing outbound rel</w:t>
+      </w:r>
+      <w:r>
+        <w:t>ay hops, and a finite carrier within the exploratory limits. Because connectivity is checked first, a link fail label can hide an aircraft failure in the same case, so the case records keep both flags.</w:t>
       </w:r>
     </w:p>
     <w:p>
@@ -7904,19 +7905,6 @@
       <w:r>
         <w:t>a physical aircraft behaves this way.</w:t>
       </w:r>
-    </w:p>
-    <w:p>
-      <w:pPr>
-        <w:sectPr>
-          <w:footnotePr>
-            <w:numRestart w:val="eachSect"/>
-          </w:footnotePr>
-          <w:type w:val="continuous"/>
-          <w:pgSz w:w="12240" w:h="15840"/>
-          <w:pgMar w:top="1080" w:right="1080" w:bottom="1080" w:left="1080" w:header="720" w:footer="432" w:gutter="0"/>
-          <w:cols w:num="2" w:space="360"/>
-        </w:sectPr>
-      </w:pPr>
     </w:p>
     <w:p>
       <w:pPr>
@@ -7929,10 +7917,9 @@
         <w:rPr>
           <w:noProof/>
         </w:rPr>
-        <w:lastRenderedPageBreak/>
         <w:drawing>
-          <wp:inline distT="0" distB="0" distL="0" distR="0" wp14:anchorId="03B06C57" wp14:editId="03B06C58">
-            <wp:extent cx="6400800" cy="2387749"/>
+          <wp:inline distT="0" distB="0" distL="0" distR="0" wp14:anchorId="54824540" wp14:editId="24A79978">
+            <wp:extent cx="3086100" cy="5851608"/>
             <wp:effectExtent l="0" t="0" r="0" b="0"/>
             <wp:docPr id="3" name="Picture 3"/>
             <wp:cNvGraphicFramePr>
@@ -7942,7 +7929,7 @@
               <a:graphicData uri="http://schemas.openxmlformats.org/drawingml/2006/picture">
                 <pic:pic xmlns:pic="http://schemas.openxmlformats.org/drawingml/2006/picture">
                   <pic:nvPicPr>
-                    <pic:cNvPr id="0" name="fig3_service_map.png"/>
+                    <pic:cNvPr id="0" name="fig3_service_map_word.png"/>
                     <pic:cNvPicPr/>
                   </pic:nvPicPr>
                   <pic:blipFill>
@@ -7954,7 +7941,7 @@
                   <pic:spPr>
                     <a:xfrm>
                       <a:off x="0" y="0"/>
-                      <a:ext cx="6400800" cy="2387749"/>
+                      <a:ext cx="3086100" cy="5851608"/>
                     </a:xfrm>
                     <a:prstGeom prst="rect">
                       <a:avLst/>
@@ -7975,32 +7962,18 @@
         <w:rPr>
           <w:b/>
         </w:rPr>
-        <w:t>Figure 3. Baseline results for the 90 primary cases. pass means the relay helps and the aircraft stays within the screening limits, size marks a solution outside those limits, NC marks a case with no solution, and link fail marks the earlier link check. All cells in the 60 m panel fail visibility. Link failures in the 120 m and 240 m panels are clear but short of margin. No case in the baseline is direct-sufficient.</w:t>
-      </w:r>
-    </w:p>
-    <w:p>
-      <w:pPr>
-        <w:sectPr>
-          <w:footnotePr>
-            <w:numRestart w:val="eachSect"/>
-          </w:footnotePr>
-          <w:type w:val="continuous"/>
-          <w:pgSz w:w="12240" w:h="15840"/>
-          <w:pgMar w:top="1080" w:right="1080" w:bottom="1080" w:left="1080" w:header="720" w:footer="432" w:gutter="0"/>
-          <w:cols w:space="360"/>
-        </w:sectPr>
-      </w:pPr>
+        <w:t>Figure 3. Baseline results for the 90 primary cases. P means the relay helps and the aircraft stays within the screening limits, S marks a solution outside those limits, NC marks a case with no solution, and L marks the earlier link check. All cells in the 60 m panel fail visibility. Link failures in the 120 m and 240 m panels are clear but short of margin. No case in the baseline is direct-sufficient.</w:t>
+      </w:r>
     </w:p>
     <w:p>
       <w:pPr>
         <w:pStyle w:val="Heading1"/>
       </w:pPr>
       <w:bookmarkStart w:id="15" w:name="results"/>
-      <w:bookmarkStart w:id="16" w:name="_Toc241054958"/>
+      <w:bookmarkStart w:id="16" w:name="_Toc241065244"/>
       <w:bookmarkEnd w:id="6"/>
       <w:bookmarkEnd w:id="14"/>
       <w:r>
-        <w:lastRenderedPageBreak/>
         <w:t>4. Results</w:t>
       </w:r>
       <w:bookmarkEnd w:id="16"/>
@@ -8020,7 +7993,11 @@
         <w:jc w:val="both"/>
       </w:pPr>
       <w:r>
-        <w:t>For a midpoint relay at 120 m, solving the zero-margin condition gives a maximum endpoint separation of 25.0 km under the baseline RF assumptions. The ground-to-relay hop binds first. A 12 dB excess-loss allowance reduces that separation to 6.3 km. Both statements require a clear path. Dwell has no effect on this boundary because time does not enter the link model.</w:t>
+        <w:t xml:space="preserve">For a midpoint relay at 120 m, solving the zero-margin condition gives a maximum endpoint separation of 25.0 km under the baseline RF assumptions. The ground-to-relay hop binds first. A 12 dB excess-loss allowance reduces that separation to 6.3 km. Both statements require a clear path. </w:t>
+      </w:r>
+      <w:r>
+        <w:lastRenderedPageBreak/>
+        <w:t>Dwell has no effect on this boundary because time does not enter the link model.</w:t>
       </w:r>
     </w:p>
     <w:p>
@@ -8053,7 +8030,7 @@
           <w:noProof/>
         </w:rPr>
         <w:drawing>
-          <wp:inline distT="0" distB="0" distL="0" distR="0" wp14:anchorId="03B06C59" wp14:editId="03B06C5A">
+          <wp:inline distT="0" distB="0" distL="0" distR="0" wp14:anchorId="4CB755AD" wp14:editId="305EB9D2">
             <wp:extent cx="3086100" cy="2513153"/>
             <wp:effectExtent l="0" t="0" r="0" b="0"/>
             <wp:docPr id="4" name="Picture 4"/>
@@ -8941,7 +8918,6 @@
       <w:bookmarkStart w:id="19" w:name="the-sampled-grid"/>
       <w:bookmarkEnd w:id="18"/>
       <w:r>
-        <w:lastRenderedPageBreak/>
         <w:t>The Sampled Grid</w:t>
       </w:r>
     </w:p>
@@ -8954,7 +8930,11 @@
         <w:t>The 90-case grid shows where those two limits fall across the sampled points. Of the 90 baseline cases, 18 pass, 6 are too large, 6 have no solution, and 60 fail the link check. Figure 3 shows the pattern. Every case at 60 m fails because the relay sits below the 100 m clearance threshold. At 120 and 240 m the 5, 10, and 20 km cases clear the screen and hold margin. Within those cases the 10 to 30 minute dwells pass, the 45 minute dwells are too large, and the 60 minute dwells have no solution. At 30 km and</w:t>
       </w:r>
       <w:r>
-        <w:t xml:space="preserve"> beyond the relay can see both endpoints but the first hop falls short of margin, which matches the 25.0 km limit from Section 4.</w:t>
+        <w:t xml:space="preserve"> beyond the relay can </w:t>
+      </w:r>
+      <w:r>
+        <w:lastRenderedPageBreak/>
+        <w:t>see both endpoints but the first hop falls short of margin, which matches the 25.0 km limit from Section 4.</w:t>
       </w:r>
     </w:p>
     <w:p>
@@ -9055,10 +9035,7 @@
         <w:jc w:val="both"/>
       </w:pPr>
       <w:r>
-        <w:t xml:space="preserve">The two secondary payload cases preserve the primary classification boundaries in the baseline grid. Mass, DC demand, and RF output change together, so this is a comparison of declared payload cases, not an isolated mass </w:t>
-      </w:r>
-      <w:r>
-        <w:t>or power experiment. Unchanged coarse labels do not establish hardware equivalence or insensitivity between sampled points.</w:t>
+        <w:t>The two secondary payload cases preserve the primary classification boundaries in the baseline grid. Mass, DC demand, and RF output change together, so this is a comparison of declared payload cases, not an isolated mass or power experiment. Unchanged coarse labels do not establish hardware equivalence or insensitivity between sampled points.</w:t>
       </w:r>
     </w:p>
     <w:p>
@@ -9073,7 +9050,7 @@
           <w:noProof/>
         </w:rPr>
         <w:drawing>
-          <wp:inline distT="0" distB="0" distL="0" distR="0" wp14:anchorId="03B06C5B" wp14:editId="03B06C5C">
+          <wp:inline distT="0" distB="0" distL="0" distR="0" wp14:anchorId="3D0B7D50" wp14:editId="7CD33F99">
             <wp:extent cx="3086100" cy="2684628"/>
             <wp:effectExtent l="0" t="0" r="0" b="0"/>
             <wp:docPr id="5" name="Picture 5"/>
@@ -9125,7 +9102,7 @@
         <w:pStyle w:val="Heading1"/>
       </w:pPr>
       <w:bookmarkStart w:id="21" w:name="discussion"/>
-      <w:bookmarkStart w:id="22" w:name="_Toc241054959"/>
+      <w:bookmarkStart w:id="22" w:name="_Toc241065245"/>
       <w:bookmarkEnd w:id="15"/>
       <w:bookmarkEnd w:id="20"/>
       <w:r>
@@ -9166,11 +9143,7 @@
         <w:jc w:val="both"/>
       </w:pPr>
       <w:r>
-        <w:t xml:space="preserve">The calculations also show the limits of the coupling. The payload supplies common mass, DC, and RF assumptions, but link margin does not resize the radio and altitude does not change the fixed-density hover calculation. Consequently, the case supports an architecture screening decision without solving a joint radio, trajectory, and vehicle optimization. For a systems engineering reader, its </w:t>
-      </w:r>
-      <w:r>
-        <w:lastRenderedPageBreak/>
-        <w:t>useful output is a traceable chain from the requested service to the resource or link assumption that limits it.</w:t>
+        <w:t>The calculations also show the limits of the coupling. The payload supplies common mass, DC, and RF assumptions, but link margin does not resize the radio and altitude does not change the fixed-density hover calculation. Consequently, the case supports an architecture screening decision without solving a joint radio, trajectory, and vehicle optimization. For a systems engineering reader, its useful output is a traceable chain from the requested service to the resource or link assumption that limits it.</w:t>
       </w:r>
     </w:p>
     <w:p>
@@ -9180,6 +9153,7 @@
       <w:bookmarkStart w:id="24" w:name="limitations"/>
       <w:bookmarkEnd w:id="23"/>
       <w:r>
+        <w:lastRenderedPageBreak/>
         <w:t>Limitations</w:t>
       </w:r>
     </w:p>
@@ -9228,10 +9202,10 @@
         <w:jc w:val="both"/>
       </w:pPr>
       <w:r>
-        <w:t xml:space="preserve">Only stationary outbound dwell is calculated. Transit, climb, recovery energy, return traffic, carrier-command performance, and station keeping remain outside the </w:t>
-      </w:r>
-      <w:r>
-        <w:t>quantitative assessment. A follow-on assessment would need matched power measurements, installed-payload characterization, a complete mission energy budget, and communications measurements for the intended service. These are evidence needs for the candidate architecture; this paper does not demonstrate those capabilities.</w:t>
+        <w:t xml:space="preserve">Only stationary outbound dwell is calculated. Transit, climb, recovery energy, return traffic, carrier-command performance, and station keeping remain outside the quantitative assessment. A follow-on assessment would need matched power measurements, installed-payload characterization, a complete mission energy budget, and </w:t>
+      </w:r>
+      <w:r>
+        <w:t>communications measurements for the intended service. These are evidence needs for the candidate architecture; this paper does not demonstrate those capabilities.</w:t>
       </w:r>
     </w:p>
     <w:p>
@@ -9239,7 +9213,7 @@
         <w:pStyle w:val="Heading1"/>
       </w:pPr>
       <w:bookmarkStart w:id="25" w:name="conclusions"/>
-      <w:bookmarkStart w:id="26" w:name="_Toc241054960"/>
+      <w:bookmarkStart w:id="26" w:name="_Toc241065246"/>
       <w:bookmarkEnd w:id="21"/>
       <w:bookmarkEnd w:id="24"/>
       <w:r>
@@ -9276,7 +9250,7 @@
         <w:pStyle w:val="Heading1"/>
       </w:pPr>
       <w:bookmarkStart w:id="27" w:name="Xfdd834b9a7a4ac0acbd2b385069b2ec5d4fd041"/>
-      <w:bookmarkStart w:id="28" w:name="_Toc241054961"/>
+      <w:bookmarkStart w:id="28" w:name="_Toc241065247"/>
       <w:bookmarkEnd w:id="25"/>
       <w:r>
         <w:t>Appendix A. Complete Carrier Mass Balance</w:t>
@@ -13688,7 +13662,7 @@
         <w:pStyle w:val="UnnumberedSection"/>
       </w:pPr>
       <w:bookmarkStart w:id="29" w:name="data-availability"/>
-      <w:bookmarkStart w:id="30" w:name="_Toc241054962"/>
+      <w:bookmarkStart w:id="30" w:name="_Toc241065248"/>
       <w:bookmarkEnd w:id="27"/>
       <w:r>
         <w:t>Data Availability</w:t>
@@ -13720,7 +13694,7 @@
         <w:pStyle w:val="UnnumberedSection"/>
       </w:pPr>
       <w:bookmarkStart w:id="31" w:name="acknowledgements"/>
-      <w:bookmarkStart w:id="32" w:name="_Toc241054963"/>
+      <w:bookmarkStart w:id="32" w:name="_Toc241065249"/>
       <w:bookmarkEnd w:id="29"/>
       <w:r>
         <w:t>Acknowledgements</w:t>
@@ -13750,7 +13724,7 @@
         <w:pStyle w:val="UnnumberedSection"/>
       </w:pPr>
       <w:bookmarkStart w:id="33" w:name="references"/>
-      <w:bookmarkStart w:id="34" w:name="_Toc241054964"/>
+      <w:bookmarkStart w:id="34" w:name="_Toc241065250"/>
       <w:bookmarkEnd w:id="31"/>
       <w:r>
         <w:t>References</w:t>
@@ -14154,7 +14128,7 @@
         <w:pStyle w:val="UnnumberedSection"/>
       </w:pPr>
       <w:bookmarkStart w:id="35" w:name="biography"/>
-      <w:bookmarkStart w:id="36" w:name="_Toc241054965"/>
+      <w:bookmarkStart w:id="36" w:name="_Toc241065251"/>
       <w:bookmarkEnd w:id="33"/>
       <w:r>
         <w:t>Biography</w:t>
@@ -14171,8 +14145,8 @@
           <w:noProof/>
         </w:rPr>
         <w:drawing>
-          <wp:inline distT="0" distB="0" distL="0" distR="0" wp14:anchorId="03B06C5D" wp14:editId="03B06C5E">
-            <wp:extent cx="914400" cy="1098378"/>
+          <wp:inline distT="0" distB="0" distL="0" distR="0" wp14:anchorId="4F3BD31B" wp14:editId="451E9CD5">
+            <wp:extent cx="1143000" cy="1372973"/>
             <wp:effectExtent l="0" t="0" r="0" b="0"/>
             <wp:docPr id="6" name="Picture 6"/>
             <wp:cNvGraphicFramePr>
@@ -14194,7 +14168,7 @@
                   <pic:spPr>
                     <a:xfrm>
                       <a:off x="0" y="0"/>
-                      <a:ext cx="914400" cy="1098378"/>
+                      <a:ext cx="1143000" cy="1372973"/>
                     </a:xfrm>
                     <a:prstGeom prst="rect">
                       <a:avLst/>
@@ -14332,7 +14306,7 @@
   <w:abstractNum w:abstractNumId="0" w15:restartNumberingAfterBreak="0">
     <w:nsid w:val="0000A990"/>
     <w:multiLevelType w:val="multilevel"/>
-    <w:tmpl w:val="4968AC4A"/>
+    <w:tmpl w:val="1B422662"/>
     <w:lvl w:ilvl="0">
       <w:numFmt w:val="bullet"/>
       <w:lvlText w:val=" "/>
@@ -14406,7 +14380,7 @@
       </w:pPr>
     </w:lvl>
   </w:abstractNum>
-  <w:num w:numId="1" w16cid:durableId="1207717379">
+  <w:num w:numId="1" w16cid:durableId="392587543">
     <w:abstractNumId w:val="0"/>
   </w:num>
 </w:numbering>
@@ -15630,7 +15604,7 @@
     <w:next w:val="Normal"/>
     <w:autoRedefine/>
     <w:uiPriority w:val="39"/>
-    <w:rsid w:val="001D3ACB"/>
+    <w:rsid w:val="006D7B38"/>
     <w:pPr>
       <w:spacing w:after="100"/>
     </w:pPr>

</xml_diff>

<commit_message>
Revise Aerospace paper around system architecture and audit results
</commit_message>
<xml_diff>
--- a/submission/relay_uas_aeroconf.docx
+++ b/submission/relay_uas_aeroconf.docx
@@ -70,35 +70,13 @@
           <w:b/>
           <w:sz w:val="18"/>
         </w:rPr>
-        <w:t>Abstract: A communications relay can clear an obstructed path while imposing an aircraft demand that a small multirotor cannot sustain. This paper develops a reproducible architecture case study that separates two questions: whether an outbound relay path has sufficient received-level margin, and whether its carrier can support the payload for the required stationary dwell. A geometric visibility test and a free-space link budget define the communications screen. A constant-disk-loading hover model then clo</w:t>
+        <w:t xml:space="preserve">Abstract: </w:t>
       </w:r>
       <w:r>
         <w:rPr>
-          <w:b/>
           <w:sz w:val="18"/>
         </w:rPr>
-        <w:t>ses the battery, propulsion, and structural mass balance on energy-sized and power-sized battery branches, using an aggregate hover coefficient fitted to five published NASA test points and checked against three commercial quadrotors held out of that fit. Under manufacturer conditions and an assumed 25 W auxiliary load, those three held-out aircraft reproduce published hover times within  to  percent, a limited consistency check that does not validate the proposed relay aircraft or its structural model. For</w:t>
-      </w:r>
-      <w:r>
-        <w:rPr>
-          <w:b/>
-          <w:sz w:val="18"/>
-        </w:rPr>
-        <w:t xml:space="preserve"> the declared 0.20 kg, 14 W payload, the reference link-margin boundary is 25.0 km of endpoint separation at a midpoint relay height of 120 m; a deterministic 12 dB excess-loss case reduces it to 6.3 km. The reference carrier, which carries no operating-condition margin beyond the laboratory hover calibration, reaches its exploratory rotor-size limit at 42.1 minutes and has no finite mass closure at or above 52.4 minutes. The scatter of the individual calibration points alone moves the first boundary betwee</w:t>
-      </w:r>
-      <w:r>
-        <w:rPr>
-          <w:b/>
-          <w:sz w:val="18"/>
-        </w:rPr>
-        <w:t>n 33 and 49 minutes. At a fixed 10 km separation, 30 minutes closes at 4.77 kg, 45 minutes at 15.15 kg outside the physical screen, and 60 minutes has no finite solution. Of 90 baseline grid cases, 18 pass both screens, 6 have excessive finite size, 6 have no closure, and 60 fail connectivity. Identifying which mechanism binds is what supports an early architecture decision. These results describe conditional outbound hover service; full-mission energy, packet performance, and physical verification remain u</w:t>
-      </w:r>
-      <w:r>
-        <w:rPr>
-          <w:b/>
-          <w:sz w:val="18"/>
-        </w:rPr>
-        <w:t>nresolved.</w:t>
+        <w:t>An airborne relay may restore a communications path that an obstruction blocks, but the carrier must hold the radio in position and supply its resources. This paper asks which parts of a small multirotor relay architecture limit a declared stationary service mission. The architecture assigns mission traffic to the payload, aircraft command to a separate carrier path, electrical power to the battery and regulated branch, and mechanical support to the airframe and mount. An assessment workflow traces those allocations through declared inputs, two coupled checks, and the evidence needed for a later physical test. A geometric visibility test and free-space link budget screen the outbound path. A constant-disk-loading hover model then closes battery, propulsion, and structural mass on energy-sized and power-sized branches. Its aggregate hover coefficient is fitted to five published NASA test points and checked against three commercial quadrotors excluded from that fit. With an assumed 25 W auxiliary load and manufacturer discharge conditions, the three comparisons reproduce published hover times within  to  percent. This checks part of the power and energy calculation; it does not validate the carrier structure or a relay aircraft. For a declared 0.20 kg, 14 W payload, the midpoint relay at 120 m has a reference link-margin boundary of 25.0 km of endpoint separation. Adding 12 dB of excess loss reduces that boundary to 6.3 km. The reference carrier reaches its exploratory rotor-size limit at 42.1 minutes and loses finite mass closure at 52.4 minutes. Its hover calibration supplies no separate operating-condition margin, and single-point refits move the first boundary between 33 and 49 minutes. At 10 km separation, a 30-minute dwell closes at 4.77 kg, a 45-minute dwell closes at 15.15 kg outside the size screen, and a 60-minute dwell has no finite solution. Of 90 baseline grid cases, 18 pass both checks, 6 exceed size limits, 6 have no closure, and 60 fail connectivity. Each failure points to a different architecture decision. These results support preliminary screening of outbound hover service; full-mission energy, packet performance, and physical verification remain unresolved.</w:t>
       </w:r>
     </w:p>
     <w:p>
@@ -120,30 +98,41 @@
         <w:tabs>
           <w:tab w:val="right" w:leader="dot" w:pos="4850"/>
         </w:tabs>
+        <w:spacing w:after="0"/>
         <w:rPr>
           <w:rFonts w:asciiTheme="minorHAnsi" w:eastAsiaTheme="minorEastAsia" w:hAnsiTheme="minorHAnsi"/>
           <w:noProof/>
           <w:color w:val="auto"/>
           <w:kern w:val="2"/>
-          <w:sz w:val="24"/>
+          <w:sz w:val="16"/>
           <w:lang w:eastAsia="en-US"/>
           <w14:ligatures w14:val="standardContextual"/>
         </w:rPr>
       </w:pPr>
       <w:r>
+        <w:rPr>
+          <w:sz w:val="16"/>
+        </w:rPr>
         <w:fldChar w:fldCharType="begin"/>
       </w:r>
       <w:r>
+        <w:rPr>
+          <w:sz w:val="16"/>
+        </w:rPr>
         <w:instrText>TOC \o "1-1" \t "Unnumbered Section,1" \h \z</w:instrText>
       </w:r>
       <w:r>
+        <w:rPr>
+          <w:sz w:val="16"/>
+        </w:rPr>
         <w:fldChar w:fldCharType="separate"/>
       </w:r>
-      <w:hyperlink w:anchor="_Toc241065241" w:history="1">
+      <w:hyperlink w:anchor="_Toc241070097" w:history="1">
         <w:r>
           <w:rPr>
             <w:rStyle w:val="Hyperlink"/>
             <w:noProof/>
+            <w:sz w:val="16"/>
           </w:rPr>
           <w:t>1. Introduction</w:t>
         </w:r>
@@ -151,6 +140,7 @@
           <w:rPr>
             <w:noProof/>
             <w:webHidden/>
+            <w:sz w:val="16"/>
           </w:rPr>
           <w:tab/>
         </w:r>
@@ -158,6 +148,7 @@
           <w:rPr>
             <w:noProof/>
             <w:webHidden/>
+            <w:sz w:val="16"/>
           </w:rPr>
           <w:fldChar w:fldCharType="begin"/>
         </w:r>
@@ -165,19 +156,22 @@
           <w:rPr>
             <w:noProof/>
             <w:webHidden/>
-          </w:rPr>
-          <w:instrText xml:space="preserve"> PAGEREF _Toc241065241 \h </w:instrText>
+            <w:sz w:val="16"/>
+          </w:rPr>
+          <w:instrText xml:space="preserve"> PAGEREF _Toc241070097 \h </w:instrText>
         </w:r>
         <w:r>
           <w:rPr>
             <w:noProof/>
             <w:webHidden/>
+            <w:sz w:val="16"/>
           </w:rPr>
         </w:r>
         <w:r>
           <w:rPr>
             <w:noProof/>
             <w:webHidden/>
+            <w:sz w:val="16"/>
           </w:rPr>
           <w:fldChar w:fldCharType="separate"/>
         </w:r>
@@ -185,6 +179,7 @@
           <w:rPr>
             <w:noProof/>
             <w:webHidden/>
+            <w:sz w:val="16"/>
           </w:rPr>
           <w:t>1</w:t>
         </w:r>
@@ -192,6 +187,7 @@
           <w:rPr>
             <w:noProof/>
             <w:webHidden/>
+            <w:sz w:val="16"/>
           </w:rPr>
           <w:fldChar w:fldCharType="end"/>
         </w:r>
@@ -203,21 +199,23 @@
         <w:tabs>
           <w:tab w:val="right" w:leader="dot" w:pos="4850"/>
         </w:tabs>
+        <w:spacing w:after="0"/>
         <w:rPr>
           <w:rFonts w:asciiTheme="minorHAnsi" w:eastAsiaTheme="minorEastAsia" w:hAnsiTheme="minorHAnsi"/>
           <w:noProof/>
           <w:color w:val="auto"/>
           <w:kern w:val="2"/>
-          <w:sz w:val="24"/>
+          <w:sz w:val="16"/>
           <w:lang w:eastAsia="en-US"/>
           <w14:ligatures w14:val="standardContextual"/>
         </w:rPr>
       </w:pPr>
-      <w:hyperlink w:anchor="_Toc241065242" w:history="1">
+      <w:hyperlink w:anchor="_Toc241070098" w:history="1">
         <w:r>
           <w:rPr>
             <w:rStyle w:val="Hyperlink"/>
             <w:noProof/>
+            <w:sz w:val="16"/>
           </w:rPr>
           <w:t>2. System and Assessment Boundary</w:t>
         </w:r>
@@ -225,6 +223,7 @@
           <w:rPr>
             <w:noProof/>
             <w:webHidden/>
+            <w:sz w:val="16"/>
           </w:rPr>
           <w:tab/>
         </w:r>
@@ -232,6 +231,7 @@
           <w:rPr>
             <w:noProof/>
             <w:webHidden/>
+            <w:sz w:val="16"/>
           </w:rPr>
           <w:fldChar w:fldCharType="begin"/>
         </w:r>
@@ -239,19 +239,22 @@
           <w:rPr>
             <w:noProof/>
             <w:webHidden/>
-          </w:rPr>
-          <w:instrText xml:space="preserve"> PAGEREF _Toc241065242 \h </w:instrText>
+            <w:sz w:val="16"/>
+          </w:rPr>
+          <w:instrText xml:space="preserve"> PAGEREF _Toc241070098 \h </w:instrText>
         </w:r>
         <w:r>
           <w:rPr>
             <w:noProof/>
             <w:webHidden/>
+            <w:sz w:val="16"/>
           </w:rPr>
         </w:r>
         <w:r>
           <w:rPr>
             <w:noProof/>
             <w:webHidden/>
+            <w:sz w:val="16"/>
           </w:rPr>
           <w:fldChar w:fldCharType="separate"/>
         </w:r>
@@ -259,6 +262,7 @@
           <w:rPr>
             <w:noProof/>
             <w:webHidden/>
+            <w:sz w:val="16"/>
           </w:rPr>
           <w:t>2</w:t>
         </w:r>
@@ -266,6 +270,7 @@
           <w:rPr>
             <w:noProof/>
             <w:webHidden/>
+            <w:sz w:val="16"/>
           </w:rPr>
           <w:fldChar w:fldCharType="end"/>
         </w:r>
@@ -277,21 +282,23 @@
         <w:tabs>
           <w:tab w:val="right" w:leader="dot" w:pos="4850"/>
         </w:tabs>
+        <w:spacing w:after="0"/>
         <w:rPr>
           <w:rFonts w:asciiTheme="minorHAnsi" w:eastAsiaTheme="minorEastAsia" w:hAnsiTheme="minorHAnsi"/>
           <w:noProof/>
           <w:color w:val="auto"/>
           <w:kern w:val="2"/>
-          <w:sz w:val="24"/>
+          <w:sz w:val="16"/>
           <w:lang w:eastAsia="en-US"/>
           <w14:ligatures w14:val="standardContextual"/>
         </w:rPr>
       </w:pPr>
-      <w:hyperlink w:anchor="_Toc241065243" w:history="1">
+      <w:hyperlink w:anchor="_Toc241070099" w:history="1">
         <w:r>
           <w:rPr>
             <w:rStyle w:val="Hyperlink"/>
             <w:noProof/>
+            <w:sz w:val="16"/>
           </w:rPr>
           <w:t>3. Method</w:t>
         </w:r>
@@ -299,6 +306,7 @@
           <w:rPr>
             <w:noProof/>
             <w:webHidden/>
+            <w:sz w:val="16"/>
           </w:rPr>
           <w:tab/>
         </w:r>
@@ -306,6 +314,7 @@
           <w:rPr>
             <w:noProof/>
             <w:webHidden/>
+            <w:sz w:val="16"/>
           </w:rPr>
           <w:fldChar w:fldCharType="begin"/>
         </w:r>
@@ -313,19 +322,22 @@
           <w:rPr>
             <w:noProof/>
             <w:webHidden/>
-          </w:rPr>
-          <w:instrText xml:space="preserve"> PAGEREF _Toc241065243 \h </w:instrText>
+            <w:sz w:val="16"/>
+          </w:rPr>
+          <w:instrText xml:space="preserve"> PAGEREF _Toc241070099 \h </w:instrText>
         </w:r>
         <w:r>
           <w:rPr>
             <w:noProof/>
             <w:webHidden/>
+            <w:sz w:val="16"/>
           </w:rPr>
         </w:r>
         <w:r>
           <w:rPr>
             <w:noProof/>
             <w:webHidden/>
+            <w:sz w:val="16"/>
           </w:rPr>
           <w:fldChar w:fldCharType="separate"/>
         </w:r>
@@ -333,6 +345,7 @@
           <w:rPr>
             <w:noProof/>
             <w:webHidden/>
+            <w:sz w:val="16"/>
           </w:rPr>
           <w:t>3</w:t>
         </w:r>
@@ -340,6 +353,7 @@
           <w:rPr>
             <w:noProof/>
             <w:webHidden/>
+            <w:sz w:val="16"/>
           </w:rPr>
           <w:fldChar w:fldCharType="end"/>
         </w:r>
@@ -351,21 +365,23 @@
         <w:tabs>
           <w:tab w:val="right" w:leader="dot" w:pos="4850"/>
         </w:tabs>
+        <w:spacing w:after="0"/>
         <w:rPr>
           <w:rFonts w:asciiTheme="minorHAnsi" w:eastAsiaTheme="minorEastAsia" w:hAnsiTheme="minorHAnsi"/>
           <w:noProof/>
           <w:color w:val="auto"/>
           <w:kern w:val="2"/>
-          <w:sz w:val="24"/>
+          <w:sz w:val="16"/>
           <w:lang w:eastAsia="en-US"/>
           <w14:ligatures w14:val="standardContextual"/>
         </w:rPr>
       </w:pPr>
-      <w:hyperlink w:anchor="_Toc241065244" w:history="1">
+      <w:hyperlink w:anchor="_Toc241070100" w:history="1">
         <w:r>
           <w:rPr>
             <w:rStyle w:val="Hyperlink"/>
             <w:noProof/>
+            <w:sz w:val="16"/>
           </w:rPr>
           <w:t>4. Results</w:t>
         </w:r>
@@ -373,6 +389,7 @@
           <w:rPr>
             <w:noProof/>
             <w:webHidden/>
+            <w:sz w:val="16"/>
           </w:rPr>
           <w:tab/>
         </w:r>
@@ -380,6 +397,7 @@
           <w:rPr>
             <w:noProof/>
             <w:webHidden/>
+            <w:sz w:val="16"/>
           </w:rPr>
           <w:fldChar w:fldCharType="begin"/>
         </w:r>
@@ -387,19 +405,22 @@
           <w:rPr>
             <w:noProof/>
             <w:webHidden/>
-          </w:rPr>
-          <w:instrText xml:space="preserve"> PAGEREF _Toc241065244 \h </w:instrText>
+            <w:sz w:val="16"/>
+          </w:rPr>
+          <w:instrText xml:space="preserve"> PAGEREF _Toc241070100 \h </w:instrText>
         </w:r>
         <w:r>
           <w:rPr>
             <w:noProof/>
             <w:webHidden/>
+            <w:sz w:val="16"/>
           </w:rPr>
         </w:r>
         <w:r>
           <w:rPr>
             <w:noProof/>
             <w:webHidden/>
+            <w:sz w:val="16"/>
           </w:rPr>
           <w:fldChar w:fldCharType="separate"/>
         </w:r>
@@ -407,6 +428,7 @@
           <w:rPr>
             <w:noProof/>
             <w:webHidden/>
+            <w:sz w:val="16"/>
           </w:rPr>
           <w:t>8</w:t>
         </w:r>
@@ -414,6 +436,7 @@
           <w:rPr>
             <w:noProof/>
             <w:webHidden/>
+            <w:sz w:val="16"/>
           </w:rPr>
           <w:fldChar w:fldCharType="end"/>
         </w:r>
@@ -425,21 +448,23 @@
         <w:tabs>
           <w:tab w:val="right" w:leader="dot" w:pos="4850"/>
         </w:tabs>
+        <w:spacing w:after="0"/>
         <w:rPr>
           <w:rFonts w:asciiTheme="minorHAnsi" w:eastAsiaTheme="minorEastAsia" w:hAnsiTheme="minorHAnsi"/>
           <w:noProof/>
           <w:color w:val="auto"/>
           <w:kern w:val="2"/>
-          <w:sz w:val="24"/>
+          <w:sz w:val="16"/>
           <w:lang w:eastAsia="en-US"/>
           <w14:ligatures w14:val="standardContextual"/>
         </w:rPr>
       </w:pPr>
-      <w:hyperlink w:anchor="_Toc241065245" w:history="1">
+      <w:hyperlink w:anchor="_Toc241070101" w:history="1">
         <w:r>
           <w:rPr>
             <w:rStyle w:val="Hyperlink"/>
             <w:noProof/>
+            <w:sz w:val="16"/>
           </w:rPr>
           <w:t>5. Discussion</w:t>
         </w:r>
@@ -447,6 +472,7 @@
           <w:rPr>
             <w:noProof/>
             <w:webHidden/>
+            <w:sz w:val="16"/>
           </w:rPr>
           <w:tab/>
         </w:r>
@@ -454,6 +480,7 @@
           <w:rPr>
             <w:noProof/>
             <w:webHidden/>
+            <w:sz w:val="16"/>
           </w:rPr>
           <w:fldChar w:fldCharType="begin"/>
         </w:r>
@@ -461,19 +488,22 @@
           <w:rPr>
             <w:noProof/>
             <w:webHidden/>
-          </w:rPr>
-          <w:instrText xml:space="preserve"> PAGEREF _Toc241065245 \h </w:instrText>
+            <w:sz w:val="16"/>
+          </w:rPr>
+          <w:instrText xml:space="preserve"> PAGEREF _Toc241070101 \h </w:instrText>
         </w:r>
         <w:r>
           <w:rPr>
             <w:noProof/>
             <w:webHidden/>
+            <w:sz w:val="16"/>
           </w:rPr>
         </w:r>
         <w:r>
           <w:rPr>
             <w:noProof/>
             <w:webHidden/>
+            <w:sz w:val="16"/>
           </w:rPr>
           <w:fldChar w:fldCharType="separate"/>
         </w:r>
@@ -481,6 +511,7 @@
           <w:rPr>
             <w:noProof/>
             <w:webHidden/>
+            <w:sz w:val="16"/>
           </w:rPr>
           <w:t>10</w:t>
         </w:r>
@@ -488,6 +519,7 @@
           <w:rPr>
             <w:noProof/>
             <w:webHidden/>
+            <w:sz w:val="16"/>
           </w:rPr>
           <w:fldChar w:fldCharType="end"/>
         </w:r>
@@ -499,21 +531,23 @@
         <w:tabs>
           <w:tab w:val="right" w:leader="dot" w:pos="4850"/>
         </w:tabs>
+        <w:spacing w:after="0"/>
         <w:rPr>
           <w:rFonts w:asciiTheme="minorHAnsi" w:eastAsiaTheme="minorEastAsia" w:hAnsiTheme="minorHAnsi"/>
           <w:noProof/>
           <w:color w:val="auto"/>
           <w:kern w:val="2"/>
-          <w:sz w:val="24"/>
+          <w:sz w:val="16"/>
           <w:lang w:eastAsia="en-US"/>
           <w14:ligatures w14:val="standardContextual"/>
         </w:rPr>
       </w:pPr>
-      <w:hyperlink w:anchor="_Toc241065246" w:history="1">
+      <w:hyperlink w:anchor="_Toc241070102" w:history="1">
         <w:r>
           <w:rPr>
             <w:rStyle w:val="Hyperlink"/>
             <w:noProof/>
+            <w:sz w:val="16"/>
           </w:rPr>
           <w:t>6. Conclusions</w:t>
         </w:r>
@@ -521,6 +555,7 @@
           <w:rPr>
             <w:noProof/>
             <w:webHidden/>
+            <w:sz w:val="16"/>
           </w:rPr>
           <w:tab/>
         </w:r>
@@ -528,6 +563,7 @@
           <w:rPr>
             <w:noProof/>
             <w:webHidden/>
+            <w:sz w:val="16"/>
           </w:rPr>
           <w:fldChar w:fldCharType="begin"/>
         </w:r>
@@ -535,19 +571,22 @@
           <w:rPr>
             <w:noProof/>
             <w:webHidden/>
-          </w:rPr>
-          <w:instrText xml:space="preserve"> PAGEREF _Toc241065246 \h </w:instrText>
+            <w:sz w:val="16"/>
+          </w:rPr>
+          <w:instrText xml:space="preserve"> PAGEREF _Toc241070102 \h </w:instrText>
         </w:r>
         <w:r>
           <w:rPr>
             <w:noProof/>
             <w:webHidden/>
+            <w:sz w:val="16"/>
           </w:rPr>
         </w:r>
         <w:r>
           <w:rPr>
             <w:noProof/>
             <w:webHidden/>
+            <w:sz w:val="16"/>
           </w:rPr>
           <w:fldChar w:fldCharType="separate"/>
         </w:r>
@@ -555,6 +594,7 @@
           <w:rPr>
             <w:noProof/>
             <w:webHidden/>
+            <w:sz w:val="16"/>
           </w:rPr>
           <w:t>11</w:t>
         </w:r>
@@ -562,6 +602,7 @@
           <w:rPr>
             <w:noProof/>
             <w:webHidden/>
+            <w:sz w:val="16"/>
           </w:rPr>
           <w:fldChar w:fldCharType="end"/>
         </w:r>
@@ -573,21 +614,23 @@
         <w:tabs>
           <w:tab w:val="right" w:leader="dot" w:pos="4850"/>
         </w:tabs>
+        <w:spacing w:after="0"/>
         <w:rPr>
           <w:rFonts w:asciiTheme="minorHAnsi" w:eastAsiaTheme="minorEastAsia" w:hAnsiTheme="minorHAnsi"/>
           <w:noProof/>
           <w:color w:val="auto"/>
           <w:kern w:val="2"/>
-          <w:sz w:val="24"/>
+          <w:sz w:val="16"/>
           <w:lang w:eastAsia="en-US"/>
           <w14:ligatures w14:val="standardContextual"/>
         </w:rPr>
       </w:pPr>
-      <w:hyperlink w:anchor="_Toc241065247" w:history="1">
+      <w:hyperlink w:anchor="_Toc241070103" w:history="1">
         <w:r>
           <w:rPr>
             <w:rStyle w:val="Hyperlink"/>
             <w:noProof/>
+            <w:sz w:val="16"/>
           </w:rPr>
           <w:t>Appendix A. Complete Carrier Mass Balance</w:t>
         </w:r>
@@ -595,6 +638,7 @@
           <w:rPr>
             <w:noProof/>
             <w:webHidden/>
+            <w:sz w:val="16"/>
           </w:rPr>
           <w:tab/>
         </w:r>
@@ -602,6 +646,7 @@
           <w:rPr>
             <w:noProof/>
             <w:webHidden/>
+            <w:sz w:val="16"/>
           </w:rPr>
           <w:fldChar w:fldCharType="begin"/>
         </w:r>
@@ -609,19 +654,22 @@
           <w:rPr>
             <w:noProof/>
             <w:webHidden/>
-          </w:rPr>
-          <w:instrText xml:space="preserve"> PAGEREF _Toc241065247 \h </w:instrText>
+            <w:sz w:val="16"/>
+          </w:rPr>
+          <w:instrText xml:space="preserve"> PAGEREF _Toc241070103 \h </w:instrText>
         </w:r>
         <w:r>
           <w:rPr>
             <w:noProof/>
             <w:webHidden/>
+            <w:sz w:val="16"/>
           </w:rPr>
         </w:r>
         <w:r>
           <w:rPr>
             <w:noProof/>
             <w:webHidden/>
+            <w:sz w:val="16"/>
           </w:rPr>
           <w:fldChar w:fldCharType="separate"/>
         </w:r>
@@ -629,6 +677,7 @@
           <w:rPr>
             <w:noProof/>
             <w:webHidden/>
+            <w:sz w:val="16"/>
           </w:rPr>
           <w:t>11</w:t>
         </w:r>
@@ -636,6 +685,7 @@
           <w:rPr>
             <w:noProof/>
             <w:webHidden/>
+            <w:sz w:val="16"/>
           </w:rPr>
           <w:fldChar w:fldCharType="end"/>
         </w:r>
@@ -647,21 +697,23 @@
         <w:tabs>
           <w:tab w:val="right" w:leader="dot" w:pos="4850"/>
         </w:tabs>
+        <w:spacing w:after="0"/>
         <w:rPr>
           <w:rFonts w:asciiTheme="minorHAnsi" w:eastAsiaTheme="minorEastAsia" w:hAnsiTheme="minorHAnsi"/>
           <w:noProof/>
           <w:color w:val="auto"/>
           <w:kern w:val="2"/>
-          <w:sz w:val="24"/>
+          <w:sz w:val="16"/>
           <w:lang w:eastAsia="en-US"/>
           <w14:ligatures w14:val="standardContextual"/>
         </w:rPr>
       </w:pPr>
-      <w:hyperlink w:anchor="_Toc241065248" w:history="1">
+      <w:hyperlink w:anchor="_Toc241070104" w:history="1">
         <w:r>
           <w:rPr>
             <w:rStyle w:val="Hyperlink"/>
             <w:noProof/>
+            <w:sz w:val="16"/>
           </w:rPr>
           <w:t>Data Availability</w:t>
         </w:r>
@@ -669,6 +721,7 @@
           <w:rPr>
             <w:noProof/>
             <w:webHidden/>
+            <w:sz w:val="16"/>
           </w:rPr>
           <w:tab/>
         </w:r>
@@ -676,6 +729,7 @@
           <w:rPr>
             <w:noProof/>
             <w:webHidden/>
+            <w:sz w:val="16"/>
           </w:rPr>
           <w:fldChar w:fldCharType="begin"/>
         </w:r>
@@ -683,19 +737,22 @@
           <w:rPr>
             <w:noProof/>
             <w:webHidden/>
-          </w:rPr>
-          <w:instrText xml:space="preserve"> PAGEREF _Toc241065248 \h </w:instrText>
+            <w:sz w:val="16"/>
+          </w:rPr>
+          <w:instrText xml:space="preserve"> PAGEREF _Toc241070104 \h </w:instrText>
         </w:r>
         <w:r>
           <w:rPr>
             <w:noProof/>
             <w:webHidden/>
+            <w:sz w:val="16"/>
           </w:rPr>
         </w:r>
         <w:r>
           <w:rPr>
             <w:noProof/>
             <w:webHidden/>
+            <w:sz w:val="16"/>
           </w:rPr>
           <w:fldChar w:fldCharType="separate"/>
         </w:r>
@@ -703,6 +760,7 @@
           <w:rPr>
             <w:noProof/>
             <w:webHidden/>
+            <w:sz w:val="16"/>
           </w:rPr>
           <w:t>12</w:t>
         </w:r>
@@ -710,6 +768,7 @@
           <w:rPr>
             <w:noProof/>
             <w:webHidden/>
+            <w:sz w:val="16"/>
           </w:rPr>
           <w:fldChar w:fldCharType="end"/>
         </w:r>
@@ -721,21 +780,23 @@
         <w:tabs>
           <w:tab w:val="right" w:leader="dot" w:pos="4850"/>
         </w:tabs>
+        <w:spacing w:after="0"/>
         <w:rPr>
           <w:rFonts w:asciiTheme="minorHAnsi" w:eastAsiaTheme="minorEastAsia" w:hAnsiTheme="minorHAnsi"/>
           <w:noProof/>
           <w:color w:val="auto"/>
           <w:kern w:val="2"/>
-          <w:sz w:val="24"/>
+          <w:sz w:val="16"/>
           <w:lang w:eastAsia="en-US"/>
           <w14:ligatures w14:val="standardContextual"/>
         </w:rPr>
       </w:pPr>
-      <w:hyperlink w:anchor="_Toc241065249" w:history="1">
+      <w:hyperlink w:anchor="_Toc241070105" w:history="1">
         <w:r>
           <w:rPr>
             <w:rStyle w:val="Hyperlink"/>
             <w:noProof/>
+            <w:sz w:val="16"/>
           </w:rPr>
           <w:t>Acknowledgements</w:t>
         </w:r>
@@ -743,6 +804,7 @@
           <w:rPr>
             <w:noProof/>
             <w:webHidden/>
+            <w:sz w:val="16"/>
           </w:rPr>
           <w:tab/>
         </w:r>
@@ -750,6 +812,7 @@
           <w:rPr>
             <w:noProof/>
             <w:webHidden/>
+            <w:sz w:val="16"/>
           </w:rPr>
           <w:fldChar w:fldCharType="begin"/>
         </w:r>
@@ -757,19 +820,30 @@
           <w:rPr>
             <w:noProof/>
             <w:webHidden/>
-          </w:rPr>
-          <w:instrText xml:space="preserve"> PAGEREF _Toc241065249 \h </w:instrText>
+            <w:sz w:val="16"/>
+          </w:rPr>
+          <w:instrText xml:space="preserve"> PAGEREF _Toc24</w:instrText>
         </w:r>
         <w:r>
           <w:rPr>
             <w:noProof/>
             <w:webHidden/>
-          </w:rPr>
+            <w:sz w:val="16"/>
+          </w:rPr>
+          <w:instrText xml:space="preserve">1070105 \h </w:instrText>
         </w:r>
         <w:r>
           <w:rPr>
             <w:noProof/>
             <w:webHidden/>
+            <w:sz w:val="16"/>
+          </w:rPr>
+        </w:r>
+        <w:r>
+          <w:rPr>
+            <w:noProof/>
+            <w:webHidden/>
+            <w:sz w:val="16"/>
           </w:rPr>
           <w:fldChar w:fldCharType="separate"/>
         </w:r>
@@ -777,6 +851,7 @@
           <w:rPr>
             <w:noProof/>
             <w:webHidden/>
+            <w:sz w:val="16"/>
           </w:rPr>
           <w:t>12</w:t>
         </w:r>
@@ -784,6 +859,7 @@
           <w:rPr>
             <w:noProof/>
             <w:webHidden/>
+            <w:sz w:val="16"/>
           </w:rPr>
           <w:fldChar w:fldCharType="end"/>
         </w:r>
@@ -795,21 +871,23 @@
         <w:tabs>
           <w:tab w:val="right" w:leader="dot" w:pos="4850"/>
         </w:tabs>
+        <w:spacing w:after="0"/>
         <w:rPr>
           <w:rFonts w:asciiTheme="minorHAnsi" w:eastAsiaTheme="minorEastAsia" w:hAnsiTheme="minorHAnsi"/>
           <w:noProof/>
           <w:color w:val="auto"/>
           <w:kern w:val="2"/>
-          <w:sz w:val="24"/>
+          <w:sz w:val="16"/>
           <w:lang w:eastAsia="en-US"/>
           <w14:ligatures w14:val="standardContextual"/>
         </w:rPr>
       </w:pPr>
-      <w:hyperlink w:anchor="_Toc241065250" w:history="1">
+      <w:hyperlink w:anchor="_Toc241070106" w:history="1">
         <w:r>
           <w:rPr>
             <w:rStyle w:val="Hyperlink"/>
             <w:noProof/>
+            <w:sz w:val="16"/>
           </w:rPr>
           <w:t>References</w:t>
         </w:r>
@@ -817,6 +895,7 @@
           <w:rPr>
             <w:noProof/>
             <w:webHidden/>
+            <w:sz w:val="16"/>
           </w:rPr>
           <w:tab/>
         </w:r>
@@ -824,6 +903,7 @@
           <w:rPr>
             <w:noProof/>
             <w:webHidden/>
+            <w:sz w:val="16"/>
           </w:rPr>
           <w:fldChar w:fldCharType="begin"/>
         </w:r>
@@ -831,19 +911,22 @@
           <w:rPr>
             <w:noProof/>
             <w:webHidden/>
-          </w:rPr>
-          <w:instrText xml:space="preserve"> PAGEREF _Toc241065250 \h </w:instrText>
+            <w:sz w:val="16"/>
+          </w:rPr>
+          <w:instrText xml:space="preserve"> PAGEREF _Toc241070106 \h </w:instrText>
         </w:r>
         <w:r>
           <w:rPr>
             <w:noProof/>
             <w:webHidden/>
+            <w:sz w:val="16"/>
           </w:rPr>
         </w:r>
         <w:r>
           <w:rPr>
             <w:noProof/>
             <w:webHidden/>
+            <w:sz w:val="16"/>
           </w:rPr>
           <w:fldChar w:fldCharType="separate"/>
         </w:r>
@@ -851,6 +934,7 @@
           <w:rPr>
             <w:noProof/>
             <w:webHidden/>
+            <w:sz w:val="16"/>
           </w:rPr>
           <w:t>12</w:t>
         </w:r>
@@ -858,6 +942,7 @@
           <w:rPr>
             <w:noProof/>
             <w:webHidden/>
+            <w:sz w:val="16"/>
           </w:rPr>
           <w:fldChar w:fldCharType="end"/>
         </w:r>
@@ -869,21 +954,23 @@
         <w:tabs>
           <w:tab w:val="right" w:leader="dot" w:pos="4850"/>
         </w:tabs>
+        <w:spacing w:after="0"/>
         <w:rPr>
           <w:rFonts w:asciiTheme="minorHAnsi" w:eastAsiaTheme="minorEastAsia" w:hAnsiTheme="minorHAnsi"/>
           <w:noProof/>
           <w:color w:val="auto"/>
           <w:kern w:val="2"/>
-          <w:sz w:val="24"/>
+          <w:sz w:val="16"/>
           <w:lang w:eastAsia="en-US"/>
           <w14:ligatures w14:val="standardContextual"/>
         </w:rPr>
       </w:pPr>
-      <w:hyperlink w:anchor="_Toc241065251" w:history="1">
+      <w:hyperlink w:anchor="_Toc241070107" w:history="1">
         <w:r>
           <w:rPr>
             <w:rStyle w:val="Hyperlink"/>
             <w:noProof/>
+            <w:sz w:val="16"/>
           </w:rPr>
           <w:t>Biography</w:t>
         </w:r>
@@ -891,6 +978,7 @@
           <w:rPr>
             <w:noProof/>
             <w:webHidden/>
+            <w:sz w:val="16"/>
           </w:rPr>
           <w:tab/>
         </w:r>
@@ -898,6 +986,7 @@
           <w:rPr>
             <w:noProof/>
             <w:webHidden/>
+            <w:sz w:val="16"/>
           </w:rPr>
           <w:fldChar w:fldCharType="begin"/>
         </w:r>
@@ -905,19 +994,22 @@
           <w:rPr>
             <w:noProof/>
             <w:webHidden/>
-          </w:rPr>
-          <w:instrText xml:space="preserve"> PAGEREF _Toc241065251 \h </w:instrText>
+            <w:sz w:val="16"/>
+          </w:rPr>
+          <w:instrText xml:space="preserve"> PAGEREF _Toc241070107 \h </w:instrText>
         </w:r>
         <w:r>
           <w:rPr>
             <w:noProof/>
             <w:webHidden/>
+            <w:sz w:val="16"/>
           </w:rPr>
         </w:r>
         <w:r>
           <w:rPr>
             <w:noProof/>
             <w:webHidden/>
+            <w:sz w:val="16"/>
           </w:rPr>
           <w:fldChar w:fldCharType="separate"/>
         </w:r>
@@ -925,6 +1017,7 @@
           <w:rPr>
             <w:noProof/>
             <w:webHidden/>
+            <w:sz w:val="16"/>
           </w:rPr>
           <w:t>13</w:t>
         </w:r>
@@ -932,13 +1025,20 @@
           <w:rPr>
             <w:noProof/>
             <w:webHidden/>
+            <w:sz w:val="16"/>
           </w:rPr>
           <w:fldChar w:fldCharType="end"/>
         </w:r>
       </w:hyperlink>
     </w:p>
     <w:p>
-      <w:r>
+      <w:pPr>
+        <w:spacing w:after="0"/>
+      </w:pPr>
+      <w:r>
+        <w:rPr>
+          <w:sz w:val="16"/>
+        </w:rPr>
         <w:fldChar w:fldCharType="end"/>
       </w:r>
     </w:p>
@@ -947,7 +1047,7 @@
         <w:pStyle w:val="Heading1"/>
       </w:pPr>
       <w:bookmarkStart w:id="1" w:name="introduction"/>
-      <w:bookmarkStart w:id="2" w:name="_Toc241065241"/>
+      <w:bookmarkStart w:id="2" w:name="_Toc241070097"/>
       <w:bookmarkEnd w:id="0"/>
       <w:r>
         <w:t>1. Introduction</w:t>
@@ -960,10 +1060,7 @@
         <w:jc w:val="both"/>
       </w:pPr>
       <w:r>
-        <w:t xml:space="preserve">A relay aircraft changes the geometry of a communications problem. A ground station may be unable to reach a remote aircraft because an obstruction crosses the direct path. Placing a radio above the obstruction can provide two clear paths, one to each endpoint. Research on unmanned aircraft systems (UAS) has examined this opportunity through aerial networking and mobile relaying [1], [2], [3]. The aircraft must sustain the useful geometry while carrying and powering the radio. This makes the communications </w:t>
-      </w:r>
-      <w:r>
-        <w:t>requirement an aircraft resource requirement as well.</w:t>
+        <w:t>A relay aircraft changes the geometry of a communications problem. A ground station may be unable to reach a remote aircraft because an obstruction crosses the direct path. Placing a radio above the obstruction can provide two clear paths, one to each endpoint. Research on unmanned aircraft systems (UAS) has examined this opportunity through aerial networking and mobile relaying [1], [2], [3]. The aircraft must sustain the useful geometry while carrying and powering the radio. This makes the communications requirement an aircraft resource requirement as well.</w:t>
       </w:r>
     </w:p>
     <w:p>
@@ -972,10 +1069,7 @@
         <w:jc w:val="both"/>
       </w:pPr>
       <w:r>
-        <w:t>Consider a 10 km separation, a remote aircraft at 100 m, and an 80 m screen between the endpoints. A midpoint relay at 120 m clears the screen in the declared geometry. Whether it can remain there for 30, 45, or 60 minutes depends on a different calculation. More battery adds mass, greater mass requires more hover power, and that power requires additional battery. A consistent mass balance can lie within a small-aircraft envelope, lie outside it, or have no finite solution under the assumed scaling relation</w:t>
-      </w:r>
-      <w:r>
-        <w:t>s.</w:t>
+        <w:t>Consider a 10 km separation, a remote aircraft at 100 m, and an 80 m screen between the endpoints. A midpoint relay at 120 m clears the screen in the declared geometry. Whether it can remain there for 30, 45, or 60 minutes depends on a different calculation. More battery adds mass, greater mass requires more hover power, and that power requires additional battery. A consistent mass balance can lie within a small-aircraft envelope, lie outside it, or have no finite solution under the assumed scaling relations.</w:t>
       </w:r>
     </w:p>
     <w:p>
@@ -984,10 +1078,7 @@
         <w:jc w:val="both"/>
       </w:pPr>
       <w:r>
-        <w:t>This paper starts with four things the relay aircraft must handle: mission traffic, aircraft command, electrical power, and payload mounting. It then checks link margin and carrier size for the same mission. Section 2 defines the architecture and assessed interval. Section 3 states the models and evidence supporting their coefficients. Section 4 presents the worked case and sampled envelope, and Sections 5 and 6 explain the decisions and limitations. An appendix gives the complete mass balance for reproduct</w:t>
-      </w:r>
-      <w:r>
-        <w:t>ion.</w:t>
+        <w:t>The architecture must account for four flows: mission traffic, aircraft command, electrical power, and mechanical support. The payload handles the first. The carrier provides the other three while holding the payload at the geometry needed for service. This paper asks where that allocation stops being plausible under the declared mission and aircraft assumptions. Section 2 defines the architecture and assessed interval. Section 3 traces the assumptions through link and carrier checks. Section 4 presents the worked case and sampled envelope, and Sections 5 and 6 explain the decisions and limits. An appendix gives the mass balance for reproduction.</w:t>
       </w:r>
     </w:p>
     <w:p>
@@ -1005,14 +1096,11 @@
         <w:jc w:val="both"/>
       </w:pPr>
       <w:r>
-        <w:t>Communication and aircraft sizing research already supplies the pieces used here. Zeng, Zhang, and Lim optimized relay transmit power together with relay trajectory [3]. Zeng, Xu, and Zhang combined rotary-wing propulsion energy with communication energy under throughput constraints [4]. Yan et al. treated battery weight as a design variable that trades stored energy against the power needed to lift it [5]. Rodrigues et al. placed relay positioning inside a propulsion-aware energy model [6]. On the aircraft</w:t>
-      </w:r>
-      <w:r>
-        <w:t xml:space="preserve"> side, Russell, Theodore, and Sekula built conceptual sizing </w:t>
+        <w:t xml:space="preserve">Communication and aircraft sizing research already supplies the pieces used here. Zeng, Zhang, and Lim optimized relay transmit power together with relay trajectory [3]. Zeng, Xu, and Zhang combined rotary-wing propulsion energy with communication energy under throughput constraints [4]. Yan et al. treated battery weight as a design variable that trades stored energy against the power needed to lift it [5]. </w:t>
       </w:r>
       <w:r>
         <w:lastRenderedPageBreak/>
-        <w:t>models for small quadcopters from test data [7]. They reported that their sizing did not close for hover missions beyond a certain length. Bershadsky, Haviland, and Johnson matched motors, propellers, and batteries to mission requirements [8]. Table 1 places these alongside the present study.</w:t>
+        <w:t>Rodrigues et al. placed relay positioning inside a propulsion-aware energy model [6]. On the aircraft side, Russell, Theodore, and Sekula built conceptual sizing models for small quadcopters from test data [7]. They reported that their sizing did not close for hover missions beyond a certain length. Bershadsky, Haviland, and Johnson matched motors, propellers, and batteries to mission requirements [8]. Table 1 places these alongside the present study.</w:t>
       </w:r>
     </w:p>
     <w:p>
@@ -1021,10 +1109,7 @@
         <w:jc w:val="both"/>
       </w:pPr>
       <w:r>
-        <w:t>The contribution is a reproducible assessment of one relay architecture. Payload mass and electrical demand connect the carrier calculation to fixed radio assumptions; the resulting screens identify connectivity failure, excessive finite size, and mathematical nonclosure separately. The analysis includes an aggregate hover-power fit and comparisons with published commercial hover times to examine part of the carrier model. It offers a worked engineering case, with traceable assumptions and distinguishable f</w:t>
-      </w:r>
-      <w:r>
-        <w:t>ailure mechanisms, rather than a new optimization method or a claim of superiority over the cited approaches.</w:t>
+        <w:t>This paper makes three contributions to a preliminary architecture assessment. First, it assigns the relay service and carrier responsibilities across four flows with a stated system boundary. Second, it connects fixed payload mass, power, and RF assumptions to separate link and aircraft checks for the same mission. Third, it traces connectivity failure, excessive finite size, and mathematical nonclosure to different decisions. An aggregate hover-power fit and published commercial hover times check part of the carrier calculation. The result is a reproducible engineering case under declared assumptions.</w:t>
       </w:r>
     </w:p>
     <w:p>
@@ -1474,7 +1559,7 @@
         <w:pStyle w:val="Heading1"/>
       </w:pPr>
       <w:bookmarkStart w:id="4" w:name="system-and-assessment-boundary"/>
-      <w:bookmarkStart w:id="5" w:name="_Toc241065242"/>
+      <w:bookmarkStart w:id="5" w:name="_Toc241070098"/>
       <w:bookmarkEnd w:id="1"/>
       <w:bookmarkEnd w:id="3"/>
       <w:r>
@@ -1488,54 +1573,8 @@
         <w:jc w:val="both"/>
       </w:pPr>
       <w:r>
-        <w:t>The relay aircraft carries a communications payload and holds an assigned position. As Figure 1(a) shows, a ground endpoint labeled G exchanges traffic with a remote aircraft labeled U, and the payload passes that traffic between them. The payload is treated as a black box. This means it is described only by what it demands from the aircraft: 0.20 kg of mass, 14 W of direct current (DC) power, and a fixed radio frequency (RF) output. The aircraft supplies the airframe, propulsion, battery and power distribu</w:t>
-      </w:r>
-      <w:r>
-        <w:t>tion, avionics, the command radio, and the payload mount. Operators, ground equipment, the remote aircraft, and spectrum authorities stay outside this boundary.</w:t>
-      </w:r>
-    </w:p>
-    <w:p>
-      <w:pPr>
-        <w:pStyle w:val="BodyText"/>
-        <w:jc w:val="both"/>
-      </w:pPr>
-      <w:r>
-        <w:t>Mission traffic passes from G through the relay payload to U. The operator uses a separate path to command the carrier. The battery supplies the aircraft and the regulated payload branch. The mount carries the payload load. This split shows what the carrier must provide for the declared relay service.</w:t>
-      </w:r>
-    </w:p>
-    <w:p>
-      <w:pPr>
-        <w:pStyle w:val="BodyText"/>
-        <w:jc w:val="both"/>
-      </w:pPr>
-      <w:r>
-        <w:t>Two design commitments follow from that split. The aircraft-to-payload boundary carries only regulated power and mechanical retention, which defines the intended accommodation boundary. Similar mass and power alone do not establish interchangeability; mounting, voltage, thermal behavior, and electromagnetic compatibility would also need verification. The operator commands the aircraft on a separate radio path, as an architectural allocation distinct from the mission traffic. While this separation is deliber</w:t>
-      </w:r>
-      <w:r>
-        <w:t>ate, it is an allocation of responsibility and not a demonstrated fault isolation, since both paths still share one battery and one airframe.</w:t>
-      </w:r>
-    </w:p>
-    <w:p>
-      <w:pPr>
-        <w:pStyle w:val="BodyText"/>
-        <w:jc w:val="both"/>
-      </w:pPr>
-      <w:r>
-        <w:t>Only the time on station is assessed quantitatively. A full mission would run from preparation through launch, transit, establishing position, relaying, monitoring, and recovery. This paper calculates the relay interval alone, and only in the direction from G through the relay R to U. The battery reserve holds energy back from that interval, but it is not a transit or recovery calculation.</w:t>
-      </w:r>
-    </w:p>
-    <w:p>
-      <w:pPr>
-        <w:sectPr>
-          <w:footnotePr>
-            <w:numRestart w:val="eachSect"/>
-          </w:footnotePr>
-          <w:type w:val="continuous"/>
-          <w:pgSz w:w="12240" w:h="15840"/>
-          <w:pgMar w:top="1080" w:right="1080" w:bottom="1080" w:left="1080" w:header="720" w:footer="432" w:gutter="0"/>
-          <w:cols w:num="2" w:space="360"/>
-        </w:sectPr>
-      </w:pPr>
+        <w:t>The relay aircraft carries a communications payload and holds an assigned position. As Figure 1(a) shows, a ground endpoint labeled G exchanges traffic with a remote aircraft labeled U, and the payload passes that traffic between them. The payload is treated as a black box. This means it is described only by what it demands from the aircraft: 0.20 kg of mass, 14 W of direct current (DC) power, and a fixed radio frequency (RF) output. The aircraft supplies the airframe, propulsion, battery and power distribution, avionics, the command radio, and the payload mount. Operators, ground equipment, the remote aircraft, and spectrum authorities stay outside this boundary.</w:t>
+      </w:r>
     </w:p>
     <w:p>
       <w:pPr>
@@ -1548,10 +1587,9 @@
         <w:rPr>
           <w:noProof/>
         </w:rPr>
-        <w:lastRenderedPageBreak/>
         <w:drawing>
-          <wp:inline distT="0" distB="0" distL="0" distR="0" wp14:anchorId="1DF1864D" wp14:editId="55BA0C1E">
-            <wp:extent cx="6400800" cy="4335031"/>
+          <wp:inline distT="0" distB="0" distL="0" distR="0" wp14:anchorId="21DA3C9E" wp14:editId="21DA3C9F">
+            <wp:extent cx="3086100" cy="4091612"/>
             <wp:effectExtent l="0" t="0" r="0" b="0"/>
             <wp:docPr id="1" name="Picture 1"/>
             <wp:cNvGraphicFramePr>
@@ -1561,7 +1599,7 @@
               <a:graphicData uri="http://schemas.openxmlformats.org/drawingml/2006/picture">
                 <pic:pic xmlns:pic="http://schemas.openxmlformats.org/drawingml/2006/picture">
                   <pic:nvPicPr>
-                    <pic:cNvPr id="0" name="fig1_architecture_geometry.png"/>
+                    <pic:cNvPr id="0" name="fig1_architecture_geometry_word.png"/>
                     <pic:cNvPicPr/>
                   </pic:nvPicPr>
                   <pic:blipFill>
@@ -1573,7 +1611,7 @@
                   <pic:spPr>
                     <a:xfrm>
                       <a:off x="0" y="0"/>
-                      <a:ext cx="6400800" cy="4335031"/>
+                      <a:ext cx="3086100" cy="4091612"/>
                     </a:xfrm>
                     <a:prstGeom prst="rect">
                       <a:avLst/>
@@ -1599,28 +1637,114 @@
     </w:p>
     <w:p>
       <w:pPr>
-        <w:sectPr>
-          <w:footnotePr>
-            <w:numRestart w:val="eachSect"/>
-          </w:footnotePr>
-          <w:type w:val="continuous"/>
-          <w:pgSz w:w="12240" w:h="15840"/>
-          <w:pgMar w:top="1080" w:right="1080" w:bottom="1080" w:left="1080" w:header="720" w:footer="432" w:gutter="0"/>
-          <w:cols w:space="360"/>
-        </w:sectPr>
-      </w:pPr>
+        <w:pStyle w:val="BodyText"/>
+        <w:jc w:val="both"/>
+      </w:pPr>
+      <w:r>
+        <w:t xml:space="preserve">Mission traffic passes from G through the relay payload to U. Aircraft command and health reporting belong to the carrier path, separate from that traffic. The battery supplies propulsion and avionics as well as the regulated payload branch. The mount transfers the payload load into the airframe. Each flow has a different failure consequence: a </w:t>
+      </w:r>
+      <w:r>
+        <w:lastRenderedPageBreak/>
+        <w:t>blocked mission path loses service, a command-path failure affects control, a power shortfall limits dwell, and an inadequate mount prevents safe support. Only the mission-link and power/mass consequences are calculated here.</w:t>
+      </w:r>
+    </w:p>
+    <w:p>
+      <w:pPr>
+        <w:pStyle w:val="BodyText"/>
+        <w:jc w:val="both"/>
+      </w:pPr>
+      <w:r>
+        <w:t>Two design commitments follow from that split. The aircraft-to-payload boundary supplies regulated power and mechanical retention, which defines the intended accommodation boundary. Similar mass and power alone do not establish interchangeability; mounting, voltage, thermal behavior, and electromagnetic compatibility still require verification. The operator commands the carrier over its own radio path. This is a logical allocation rather than demonstrated fault isolation, since both information paths share one battery and airframe.</w:t>
+      </w:r>
+    </w:p>
+    <w:p>
+      <w:pPr>
+        <w:pStyle w:val="BodyText"/>
+        <w:jc w:val="both"/>
+      </w:pPr>
+      <w:r>
+        <w:t>Only the time on station is assessed quantitatively. A full mission would run from preparation through launch, transit, establishing position, relaying, monitoring, and recovery. This paper calculates the relay interval alone, and only in the direction from G through the relay R to U. The battery reserve holds energy back from that interval, but it is not a transit or recovery calculation.</w:t>
+      </w:r>
     </w:p>
     <w:p>
       <w:pPr>
         <w:pStyle w:val="Heading1"/>
       </w:pPr>
       <w:bookmarkStart w:id="6" w:name="method"/>
-      <w:bookmarkStart w:id="7" w:name="_Toc241065243"/>
+      <w:bookmarkStart w:id="7" w:name="_Toc241070099"/>
       <w:bookmarkEnd w:id="4"/>
       <w:r>
         <w:t>3. Method</w:t>
       </w:r>
       <w:bookmarkEnd w:id="7"/>
+    </w:p>
+    <w:p>
+      <w:pPr>
+        <w:pStyle w:val="FirstParagraph"/>
+        <w:jc w:val="both"/>
+      </w:pPr>
+      <w:r>
+        <w:t>The assessment follows selected system definition and verification practices described in the NASA Systems Engineering Handbook [9]. It starts with the requested relay service, sets the system boundary, and allocates responsibilities before evaluating link and carrier resources. Figure 2 shows how declared inputs enter both checks and how their results support a design decision. The independent numerical checker verifies the model’s arithmetic and saved cases. No integrated aircraft was built or tested for this study, so product verification and operational validation remain future work. This is an analysis workflow, not a completed development lifecycle.</w:t>
+      </w:r>
+    </w:p>
+    <w:p>
+      <w:pPr>
+        <w:pStyle w:val="BodyText"/>
+        <w:keepNext/>
+        <w:spacing w:after="60"/>
+        <w:jc w:val="center"/>
+      </w:pPr>
+      <w:r>
+        <w:rPr>
+          <w:noProof/>
+        </w:rPr>
+        <w:drawing>
+          <wp:inline distT="0" distB="0" distL="0" distR="0" wp14:anchorId="21DA3CA0" wp14:editId="21DA3CA1">
+            <wp:extent cx="3086100" cy="4078964"/>
+            <wp:effectExtent l="0" t="0" r="0" b="0"/>
+            <wp:docPr id="2" name="Picture 2"/>
+            <wp:cNvGraphicFramePr>
+              <a:graphicFrameLocks xmlns:a="http://schemas.openxmlformats.org/drawingml/2006/main" noChangeAspect="1"/>
+            </wp:cNvGraphicFramePr>
+            <a:graphic xmlns:a="http://schemas.openxmlformats.org/drawingml/2006/main">
+              <a:graphicData uri="http://schemas.openxmlformats.org/drawingml/2006/picture">
+                <pic:pic xmlns:pic="http://schemas.openxmlformats.org/drawingml/2006/picture">
+                  <pic:nvPicPr>
+                    <pic:cNvPr id="0" name="architecture_assessment_workflow.png"/>
+                    <pic:cNvPicPr/>
+                  </pic:nvPicPr>
+                  <pic:blipFill>
+                    <a:blip r:embed="rId9"/>
+                    <a:stretch>
+                      <a:fillRect/>
+                    </a:stretch>
+                  </pic:blipFill>
+                  <pic:spPr>
+                    <a:xfrm>
+                      <a:off x="0" y="0"/>
+                      <a:ext cx="3086100" cy="4078964"/>
+                    </a:xfrm>
+                    <a:prstGeom prst="rect">
+                      <a:avLst/>
+                    </a:prstGeom>
+                  </pic:spPr>
+                </pic:pic>
+              </a:graphicData>
+            </a:graphic>
+          </wp:inline>
+        </w:drawing>
+      </w:r>
+    </w:p>
+    <w:p>
+      <w:pPr>
+        <w:jc w:val="center"/>
+      </w:pPr>
+      <w:r>
+        <w:rPr>
+          <w:b/>
+        </w:rPr>
+        <w:t>Figure 2. Architecture assessment workflow. The service need and four allocated flows lead to declared inputs, parallel link and carrier checks, and independent model review. Failure labels identify which architecture assumption or resource needs reconsideration. Installed-payload tests and operational validation remain outstanding.</w:t>
+      </w:r>
     </w:p>
     <w:p>
       <w:pPr>
@@ -2183,6 +2307,7 @@
               <w:rPr>
                 <w:sz w:val="18"/>
               </w:rPr>
+              <w:lastRenderedPageBreak/>
               <w:t>Other loss; threshold</w:t>
             </w:r>
           </w:p>
@@ -2422,7 +2547,7 @@
               <w:rPr>
                 <w:sz w:val="18"/>
               </w:rPr>
-              <w:t>Aggregate fit [9]</w:t>
+              <w:t>Aggregate fit [10]</w:t>
             </w:r>
           </w:p>
         </w:tc>
@@ -2542,7 +2667,7 @@
               <w:rPr>
                 <w:sz w:val="18"/>
               </w:rPr>
-              <w:t>Production pack [10]</w:t>
+              <w:t>Production pack [11]</w:t>
             </w:r>
           </w:p>
         </w:tc>
@@ -2802,7 +2927,6 @@
               <w:rPr>
                 <w:sz w:val="18"/>
               </w:rPr>
-              <w:lastRenderedPageBreak/>
               <w:t xml:space="preserve">Battery specific power </w:t>
             </w:r>
             <m:oMath>
@@ -3162,10 +3286,7 @@
         <w:jc w:val="both"/>
       </w:pPr>
       <w:r>
-        <w:t xml:space="preserve">The study samples declared geometries and durations rather than observed operations. Heights are measured from a common ground datum, with the ground endpoint at 0 m and the remote aircraft at 100 m. The relay sits at the horizontal midpoint at 60, 120, or 240 m. Endpoint separation takes six values from 5 to 60 km and dwell takes five values from 10 to 60 minutes. Table 2 lists these inputs. The baseline scenario places an 80 m opaque screen at 40 percent of the separation. Four variants move that screen, </w:t>
-      </w:r>
-      <w:r>
-        <w:t>one variant adds 12 dB of loss, and one comparator removes the screen entirely. These are stylized visibility cases, not terrain.</w:t>
+        <w:t>The study samples declared geometries and durations rather than observed operations. Heights are measured from a common ground datum, with the ground endpoint at 0 m and the remote aircraft at 100 m. The relay sits at the horizontal midpoint at 60, 120, or 240 m. Endpoint separation takes six values from 5 to 60 km and dwell takes five values from 10 to 60 minutes. Table 2 lists these inputs. The baseline scenario places an 80 m opaque screen at 40 percent of the separation. Four variants move that screen, one variant adds 12 dB of loss, and one comparator removes the screen entirely. These are stylized visibility cases, not terrain.</w:t>
       </w:r>
     </w:p>
     <w:p>
@@ -3174,7 +3295,7 @@
         <w:jc w:val="both"/>
       </w:pPr>
       <w:r>
-        <w:t xml:space="preserve">The payload values come from a commercial mesh radio module with a published mass of 102 g, 5 W receive consumption, 14 W peak consumption, and 1.6 W maximum transmit power [11]. The model adds 98 g for unselected integration hardware and applies the 14 W peak value continuously. Applying the listed peak continuously is a sizing assumption. The stated maximum RF output and DC consumption have not been verified as a simultaneous operating point. The receiver threshold of </w:t>
+        <w:t xml:space="preserve">The payload values come from a commercial mesh radio module with a published mass of 102 g, 5 W receive consumption, 14 W peak consumption, and 1.6 W maximum transmit power [12]. The model adds 98 g for unselected integration hardware and applies the 14 W peak value continuously. Applying the listed peak continuously is a sizing assumption. The stated maximum RF output and DC consumption have not been verified as a simultaneous operating point. The receiver threshold of </w:t>
       </w:r>
       <m:oMath>
         <m:r>
@@ -3269,13 +3390,7 @@
                 <w:rPr>
                   <w:rFonts w:ascii="Cambria Math" w:hAnsi="Cambria Math"/>
                 </w:rPr>
-                <m:t>t</m:t>
-              </m:r>
-              <m:r>
-                <w:rPr>
-                  <w:rFonts w:ascii="Cambria Math" w:hAnsi="Cambria Math"/>
-                </w:rPr>
-                <m:t>h</m:t>
+                <m:t>th</m:t>
               </m:r>
             </m:sub>
           </m:sSub>
@@ -3393,13 +3508,7 @@
                 <w:rPr>
                   <w:rFonts w:ascii="Cambria Math" w:hAnsi="Cambria Math"/>
                 </w:rPr>
-                <m:t> </m:t>
-              </m:r>
-              <m:r>
-                <w:rPr>
-                  <w:rFonts w:ascii="Cambria Math" w:hAnsi="Cambria Math"/>
-                </w:rPr>
-                <m:t>r</m:t>
+                <m:t> r</m:t>
               </m:r>
             </m:num>
             <m:den>
@@ -3534,10 +3643,7 @@
         </m:r>
       </m:oMath>
       <w:r>
-        <w:t xml:space="preserve">, this threshold is 100 </w:t>
-      </w:r>
-      <w:r>
-        <w:t>m. This means a relay at or below 100 m leaves the first hop blocked. Heights are compared strictly, so a path that just grazes the screen counts as blocked. This expression applies to a screen between the ground endpoint and the relay, as in every screened scenario here. The second hop does not cross that screen. The screen is an opaque plane, and the model includes no diffraction, Fresnel-zone clearance, or earth curvature.</w:t>
+        <w:t>, this threshold is 100 m. This means a relay at or below 100 m leaves the first hop blocked. Heights are compared strictly, so a path that just grazes the screen counts as blocked. This expression applies to a screen between the ground endpoint and the relay, as in every screened scenario here. The second hop does not cross that screen. The screen is an opaque plane, and the model includes no diffraction, Fresnel-zone clearance, or earth curvature.</w:t>
       </w:r>
     </w:p>
     <w:p>
@@ -3557,10 +3663,7 @@
         </m:r>
       </m:oMath>
       <w:r>
-        <w:t xml:space="preserve"> </w:t>
-      </w:r>
-      <w:r>
-        <w:t xml:space="preserve">in kilometers at frequency </w:t>
+        <w:t xml:space="preserve"> in kilometers at frequency </w:t>
       </w:r>
       <m:oMath>
         <m:r>
@@ -3733,7 +3836,7 @@
         <w:jc w:val="both"/>
       </w:pPr>
       <w:r>
-        <w:t>following the free-space transmission relation [12], [13]. The implementation retains 32.44 for the unit conversion; P.525 prints the rounded value 32.4. The link margin is the received level above the receiver threshold,</w:t>
+        <w:t>following the free-space transmission relation [13], [14]. The implementation retains 32.44 for the unit conversion; P.525 prints the rounded value 32.4. The link margin is the received level above the receiver threshold,</w:t>
       </w:r>
     </w:p>
     <w:p>
@@ -4212,7 +4315,7 @@
         </m:sSup>
       </m:oMath>
       <w:r>
-        <w:t xml:space="preserve">, so area grows in proportion to mass. Momentum theory then gives ideal hover power, and dividing by the rotor figure of merit and the drive efficiency converts that to electrical power [14], [15]. The result is proportional to gross mass </w:t>
+        <w:t xml:space="preserve">, so area grows in proportion to mass. Momentum theory then gives ideal hover power, and dividing by the rotor figure of merit and the drive efficiency converts that to electrical power [15], [16]. The result is proportional to gross mass </w:t>
       </w:r>
       <m:oMath>
         <m:r>
@@ -4255,19 +4358,7 @@
             <w:rPr>
               <w:rFonts w:ascii="Cambria Math" w:hAnsi="Cambria Math"/>
             </w:rPr>
-            <m:t>k</m:t>
-          </m:r>
-          <m:r>
-            <w:rPr>
-              <w:rFonts w:ascii="Cambria Math" w:hAnsi="Cambria Math"/>
-            </w:rPr>
-            <m:t> </m:t>
-          </m:r>
-          <m:r>
-            <w:rPr>
-              <w:rFonts w:ascii="Cambria Math" w:hAnsi="Cambria Math"/>
-            </w:rPr>
-            <m:t>m</m:t>
+            <m:t>k m</m:t>
           </m:r>
           <m:r>
             <m:rPr>
@@ -4282,13 +4373,7 @@
             <w:rPr>
               <w:rFonts w:ascii="Cambria Math" w:hAnsi="Cambria Math"/>
             </w:rPr>
-            <m:t>  </m:t>
-          </m:r>
-          <m:r>
-            <w:rPr>
-              <w:rFonts w:ascii="Cambria Math" w:hAnsi="Cambria Math"/>
-            </w:rPr>
-            <m:t>k</m:t>
+            <m:t>  k</m:t>
           </m:r>
           <m:r>
             <m:rPr>
@@ -4312,13 +4397,7 @@
                 <w:rPr>
                   <w:rFonts w:ascii="Cambria Math" w:hAnsi="Cambria Math"/>
                 </w:rPr>
-                <m:t>g</m:t>
-              </m:r>
-              <m:r>
-                <w:rPr>
-                  <w:rFonts w:ascii="Cambria Math" w:hAnsi="Cambria Math"/>
-                </w:rPr>
-                <m:t> </m:t>
+                <m:t>g </m:t>
               </m:r>
               <m:sSub>
                 <m:sSubPr>
@@ -4351,19 +4430,7 @@
                 <w:rPr>
                   <w:rFonts w:ascii="Cambria Math" w:hAnsi="Cambria Math"/>
                 </w:rPr>
-                <m:t>FM</m:t>
-              </m:r>
-              <m:r>
-                <w:rPr>
-                  <w:rFonts w:ascii="Cambria Math" w:hAnsi="Cambria Math"/>
-                </w:rPr>
-                <m:t> </m:t>
-              </m:r>
-              <m:r>
-                <w:rPr>
-                  <w:rFonts w:ascii="Cambria Math" w:hAnsi="Cambria Math"/>
-                </w:rPr>
-                <m:t>η</m:t>
+                <m:t>FM η</m:t>
               </m:r>
             </m:den>
           </m:f>
@@ -4399,13 +4466,7 @@
                     <w:rPr>
                       <w:rFonts w:ascii="Cambria Math" w:hAnsi="Cambria Math"/>
                     </w:rPr>
-                    <m:t>2</m:t>
-                  </m:r>
-                  <m:r>
-                    <w:rPr>
-                      <w:rFonts w:ascii="Cambria Math" w:hAnsi="Cambria Math"/>
-                    </w:rPr>
-                    <m:t>ρ</m:t>
+                    <m:t>2ρ</m:t>
                   </m:r>
                 </m:den>
               </m:f>
@@ -4452,10 +4513,7 @@
         </m:r>
       </m:oMath>
       <w:r>
-        <w:t xml:space="preserve"> </w:t>
-      </w:r>
-      <w:r>
-        <w:t xml:space="preserve">is the figure of merit, </w:t>
+        <w:t xml:space="preserve"> is the figure of merit, </w:t>
       </w:r>
       <m:oMath>
         <m:r>
@@ -4536,19 +4594,7 @@
           <w:rPr>
             <w:rFonts w:ascii="Cambria Math" w:hAnsi="Cambria Math"/>
           </w:rPr>
-          <m:t>FM</m:t>
-        </m:r>
-        <m:r>
-          <w:rPr>
-            <w:rFonts w:ascii="Cambria Math" w:hAnsi="Cambria Math"/>
-          </w:rPr>
-          <m:t> </m:t>
-        </m:r>
-        <m:r>
-          <w:rPr>
-            <w:rFonts w:ascii="Cambria Math" w:hAnsi="Cambria Math"/>
-          </w:rPr>
-          <m:t>η</m:t>
+          <m:t>FM η</m:t>
         </m:r>
         <m:r>
           <m:rPr>
@@ -4597,10 +4643,7 @@
         </m:r>
       </m:oMath>
       <w:r>
-        <w:t xml:space="preserve"> </w:t>
-      </w:r>
-      <w:r>
-        <w:t xml:space="preserve">is 108.4 W/kg. The model therefore describes a family of aircraft that are resized as mass grows, not one airframe carrying a bigger battery. Applying a separate 15 percent operating margin on top of the fitted relation would raise </w:t>
+        <w:t xml:space="preserve"> is 108.4 W/kg. The model therefore describes a family of aircraft that are resized as mass grows, not one airframe carrying a bigger battery. Applying a separate 15 percent operating margin on top of the fitted relation would raise </w:t>
       </w:r>
       <m:oMath>
         <m:r>
@@ -4611,11 +4654,7 @@
         </m:r>
       </m:oMath>
       <w:r>
-        <w:t xml:space="preserve"> to 124.7 W/kg and move the carrier boundaries </w:t>
-      </w:r>
-      <w:r>
-        <w:lastRenderedPageBreak/>
-        <w:t>reported in Section 4 from 42.1 and 52.4 minutes to 35.7 and 44.5 minutes.</w:t>
+        <w:t xml:space="preserve"> to 124.7 W/kg and move the carrier boundaries reported in Section 4 from 42.1 and 52.4 minutes to 35.7 and 44.5 minutes.</w:t>
       </w:r>
     </w:p>
     <w:p>
@@ -4646,10 +4685,7 @@
         </m:r>
       </m:oMath>
       <w:r>
-        <w:t xml:space="preserve"> </w:t>
-      </w:r>
-      <w:r>
-        <w:t xml:space="preserve">for hover plus a fixed 40.2 W for avionics and the payload, and only the usable fraction </w:t>
+        <w:t xml:space="preserve"> for hover plus a fixed 40.2 W for avionics and the payload, and only the usable fraction </w:t>
       </w:r>
       <m:oMath>
         <m:r>
@@ -4695,55 +4731,165 @@
           <m:jc m:val="center"/>
         </m:oMathParaPr>
         <m:oMath>
-          <m:sSub>
-            <m:sSubPr>
+          <m:eqArr>
+            <m:eqArrPr>
               <m:ctrlPr>
                 <w:rPr>
                   <w:rFonts w:ascii="Cambria Math" w:hAnsi="Cambria Math"/>
                 </w:rPr>
               </m:ctrlPr>
-            </m:sSubPr>
+            </m:eqArrPr>
             <m:e>
-              <m:r>
-                <w:rPr>
-                  <w:rFonts w:ascii="Cambria Math" w:hAnsi="Cambria Math"/>
-                </w:rPr>
-                <m:t>m</m:t>
+              <m:sSub>
+                <m:sSubPr>
+                  <m:ctrlPr>
+                    <w:rPr>
+                      <w:rFonts w:ascii="Cambria Math" w:hAnsi="Cambria Math"/>
+                    </w:rPr>
+                  </m:ctrlPr>
+                </m:sSubPr>
+                <m:e>
+                  <m:r>
+                    <w:rPr>
+                      <w:rFonts w:ascii="Cambria Math" w:hAnsi="Cambria Math"/>
+                    </w:rPr>
+                    <m:t>m</m:t>
+                  </m:r>
+                </m:e>
+                <m:sub>
+                  <m:r>
+                    <w:rPr>
+                      <w:rFonts w:ascii="Cambria Math" w:hAnsi="Cambria Math"/>
+                    </w:rPr>
+                    <m:t>b</m:t>
+                  </m:r>
+                </m:sub>
+              </m:sSub>
+              <m:r>
+                <w:rPr>
+                  <w:rFonts w:ascii="Cambria Math" w:hAnsi="Cambria Math"/>
+                </w:rPr>
+                <m:t>&amp;</m:t>
+              </m:r>
+              <m:r>
+                <m:rPr>
+                  <m:sty m:val="p"/>
+                </m:rPr>
+                <w:rPr>
+                  <w:rFonts w:ascii="Cambria Math" w:hAnsi="Cambria Math"/>
+                </w:rPr>
+                <m:t>=max(</m:t>
+              </m:r>
+              <m:sSub>
+                <m:sSubPr>
+                  <m:ctrlPr>
+                    <w:rPr>
+                      <w:rFonts w:ascii="Cambria Math" w:hAnsi="Cambria Math"/>
+                    </w:rPr>
+                  </m:ctrlPr>
+                </m:sSubPr>
+                <m:e>
+                  <m:r>
+                    <w:rPr>
+                      <w:rFonts w:ascii="Cambria Math" w:hAnsi="Cambria Math"/>
+                    </w:rPr>
+                    <m:t>m</m:t>
+                  </m:r>
+                </m:e>
+                <m:sub>
+                  <m:r>
+                    <w:rPr>
+                      <w:rFonts w:ascii="Cambria Math" w:hAnsi="Cambria Math"/>
+                    </w:rPr>
+                    <m:t>E</m:t>
+                  </m:r>
+                </m:sub>
+              </m:sSub>
+              <m:r>
+                <m:rPr>
+                  <m:sty m:val="p"/>
+                </m:rPr>
+                <w:rPr>
+                  <w:rFonts w:ascii="Cambria Math" w:hAnsi="Cambria Math"/>
+                </w:rPr>
+                <m:t>,</m:t>
+              </m:r>
+              <m:sSub>
+                <m:sSubPr>
+                  <m:ctrlPr>
+                    <w:rPr>
+                      <w:rFonts w:ascii="Cambria Math" w:hAnsi="Cambria Math"/>
+                    </w:rPr>
+                  </m:ctrlPr>
+                </m:sSubPr>
+                <m:e>
+                  <m:r>
+                    <w:rPr>
+                      <w:rFonts w:ascii="Cambria Math" w:hAnsi="Cambria Math"/>
+                    </w:rPr>
+                    <m:t>m</m:t>
+                  </m:r>
+                </m:e>
+                <m:sub>
+                  <m:r>
+                    <w:rPr>
+                      <w:rFonts w:ascii="Cambria Math" w:hAnsi="Cambria Math"/>
+                    </w:rPr>
+                    <m:t>P</m:t>
+                  </m:r>
+                </m:sub>
+              </m:sSub>
+              <m:r>
+                <m:rPr>
+                  <m:sty m:val="p"/>
+                </m:rPr>
+                <w:rPr>
+                  <w:rFonts w:ascii="Cambria Math" w:hAnsi="Cambria Math"/>
+                </w:rPr>
+                <m:t>),</m:t>
               </m:r>
             </m:e>
-            <m:sub>
-              <m:r>
-                <w:rPr>
-                  <w:rFonts w:ascii="Cambria Math" w:hAnsi="Cambria Math"/>
-                </w:rPr>
-                <m:t>b</m:t>
-              </m:r>
-            </m:sub>
-          </m:sSub>
-          <m:r>
-            <m:rPr>
-              <m:sty m:val="p"/>
-            </m:rPr>
-            <w:rPr>
-              <w:rFonts w:ascii="Cambria Math" w:hAnsi="Cambria Math"/>
-            </w:rPr>
-            <m:t>=max</m:t>
-          </m:r>
-          <m:r>
-            <w:rPr>
-              <w:rFonts w:ascii="Cambria Math" w:hAnsi="Cambria Math"/>
-            </w:rPr>
-            <m:t>​</m:t>
-          </m:r>
-          <m:d>
-            <m:dPr>
-              <m:ctrlPr>
-                <w:rPr>
-                  <w:rFonts w:ascii="Cambria Math" w:hAnsi="Cambria Math"/>
-                </w:rPr>
-              </m:ctrlPr>
-            </m:dPr>
             <m:e>
+              <m:sSub>
+                <m:sSubPr>
+                  <m:ctrlPr>
+                    <w:rPr>
+                      <w:rFonts w:ascii="Cambria Math" w:hAnsi="Cambria Math"/>
+                    </w:rPr>
+                  </m:ctrlPr>
+                </m:sSubPr>
+                <m:e>
+                  <m:r>
+                    <w:rPr>
+                      <w:rFonts w:ascii="Cambria Math" w:hAnsi="Cambria Math"/>
+                    </w:rPr>
+                    <m:t>m</m:t>
+                  </m:r>
+                </m:e>
+                <m:sub>
+                  <m:r>
+                    <w:rPr>
+                      <w:rFonts w:ascii="Cambria Math" w:hAnsi="Cambria Math"/>
+                    </w:rPr>
+                    <m:t>E</m:t>
+                  </m:r>
+                </m:sub>
+              </m:sSub>
+              <m:r>
+                <w:rPr>
+                  <w:rFonts w:ascii="Cambria Math" w:hAnsi="Cambria Math"/>
+                </w:rPr>
+                <m:t>&amp;</m:t>
+              </m:r>
+              <m:r>
+                <m:rPr>
+                  <m:sty m:val="p"/>
+                </m:rPr>
+                <w:rPr>
+                  <w:rFonts w:ascii="Cambria Math" w:hAnsi="Cambria Math"/>
+                </w:rPr>
+                <m:t>=</m:t>
+              </m:r>
               <m:f>
                 <m:fPr>
                   <m:ctrlPr>
@@ -4815,12 +4961,6 @@
                     <w:rPr>
                       <w:rFonts w:ascii="Cambria Math" w:hAnsi="Cambria Math"/>
                     </w:rPr>
-                    <m:t> </m:t>
-                  </m:r>
-                  <m:r>
-                    <w:rPr>
-                      <w:rFonts w:ascii="Cambria Math" w:hAnsi="Cambria Math"/>
-                    </w:rPr>
                     <m:t>t</m:t>
                   </m:r>
                 </m:num>
@@ -4829,19 +4969,7 @@
                     <w:rPr>
                       <w:rFonts w:ascii="Cambria Math" w:hAnsi="Cambria Math"/>
                     </w:rPr>
-                    <m:t>u</m:t>
-                  </m:r>
-                  <m:r>
-                    <w:rPr>
-                      <w:rFonts w:ascii="Cambria Math" w:hAnsi="Cambria Math"/>
-                    </w:rPr>
-                    <m:t> </m:t>
-                  </m:r>
-                  <m:r>
-                    <w:rPr>
-                      <w:rFonts w:ascii="Cambria Math" w:hAnsi="Cambria Math"/>
-                    </w:rPr>
-                    <m:t>e</m:t>
+                    <m:t>ue</m:t>
                   </m:r>
                 </m:den>
               </m:f>
@@ -4854,11 +4982,47 @@
                 </w:rPr>
                 <m:t>,</m:t>
               </m:r>
-              <m:r>
-                <w:rPr>
-                  <w:rFonts w:ascii="Cambria Math" w:hAnsi="Cambria Math"/>
-                </w:rPr>
-                <m:t> </m:t>
+            </m:e>
+            <m:e>
+              <m:sSub>
+                <m:sSubPr>
+                  <m:ctrlPr>
+                    <w:rPr>
+                      <w:rFonts w:ascii="Cambria Math" w:hAnsi="Cambria Math"/>
+                    </w:rPr>
+                  </m:ctrlPr>
+                </m:sSubPr>
+                <m:e>
+                  <m:r>
+                    <w:rPr>
+                      <w:rFonts w:ascii="Cambria Math" w:hAnsi="Cambria Math"/>
+                    </w:rPr>
+                    <m:t>m</m:t>
+                  </m:r>
+                </m:e>
+                <m:sub>
+                  <m:r>
+                    <w:rPr>
+                      <w:rFonts w:ascii="Cambria Math" w:hAnsi="Cambria Math"/>
+                    </w:rPr>
+                    <m:t>P</m:t>
+                  </m:r>
+                </m:sub>
+              </m:sSub>
+              <m:r>
+                <w:rPr>
+                  <w:rFonts w:ascii="Cambria Math" w:hAnsi="Cambria Math"/>
+                </w:rPr>
+                <m:t>&amp;</m:t>
+              </m:r>
+              <m:r>
+                <m:rPr>
+                  <m:sty m:val="p"/>
+                </m:rPr>
+                <w:rPr>
+                  <w:rFonts w:ascii="Cambria Math" w:hAnsi="Cambria Math"/>
+                </w:rPr>
+                <m:t>=</m:t>
               </m:r>
               <m:f>
                 <m:fPr>
@@ -4873,7 +5037,7 @@
                     <w:rPr>
                       <w:rFonts w:ascii="Cambria Math" w:hAnsi="Cambria Math"/>
                     </w:rPr>
-                    <m:t>1.15 </m:t>
+                    <m:t>1.15</m:t>
                   </m:r>
                   <m:r>
                     <m:rPr>
@@ -4983,17 +5147,17 @@
                   </m:r>
                 </m:den>
               </m:f>
+              <m:r>
+                <m:rPr>
+                  <m:sty m:val="p"/>
+                </m:rPr>
+                <w:rPr>
+                  <w:rFonts w:ascii="Cambria Math" w:hAnsi="Cambria Math"/>
+                </w:rPr>
+                <m:t>.</m:t>
+              </m:r>
             </m:e>
-          </m:d>
-          <m:r>
-            <m:rPr>
-              <m:sty m:val="p"/>
-            </m:rPr>
-            <w:rPr>
-              <w:rFonts w:ascii="Cambria Math" w:hAnsi="Cambria Math"/>
-            </w:rPr>
-            <m:t>.</m:t>
-          </m:r>
+          </m:eqArr>
           <m:r>
             <w:rPr>
               <w:rFonts w:ascii="Cambria Math" w:hAnsi="Cambria Math"/>
@@ -5315,10 +5479,7 @@
         </m:sSub>
       </m:oMath>
       <w:r>
-        <w:t xml:space="preserve"> is the branch growth factor, which is the fraction of any added kilogram that the aircraft must add again as battery, propulsion, and structure. Table 2 gives the inputs behind both. The energy branch grows with dwell. The power </w:t>
-      </w:r>
-      <w:r>
-        <w:t>branch remains unchanged. The physical mass map takes the larger battery requirement at each trial mass.</w:t>
+        <w:t xml:space="preserve"> is the branch growth factor, which is the fraction of any added kilogram that the aircraft must add again as battery, propulsion, and structure. Table 2 gives the inputs behind both. The energy branch grows with dwell. The power branch remains unchanged. The physical mass map takes the larger battery requirement at each trial mass.</w:t>
       </w:r>
     </w:p>
     <w:p>
@@ -5901,7 +6062,7 @@
               <w:rPr>
                 <w:sz w:val="18"/>
               </w:rPr>
-              <w:t>3DR SOLO, NASA hover test [9]</w:t>
+              <w:t>3DR SOLO, NASA hover test [10]</w:t>
             </w:r>
           </w:p>
         </w:tc>
@@ -6053,7 +6214,7 @@
               <w:rPr>
                 <w:sz w:val="18"/>
               </w:rPr>
-              <w:t>DJI Phantom 3, NASA hover test [9]</w:t>
+              <w:t>DJI Phantom 3, NASA hover test [10]</w:t>
             </w:r>
           </w:p>
         </w:tc>
@@ -6205,7 +6366,7 @@
               <w:rPr>
                 <w:sz w:val="18"/>
               </w:rPr>
-              <w:t>3DR Iris+, NASA hover test [9]</w:t>
+              <w:t>3DR Iris+, NASA hover test [10]</w:t>
             </w:r>
           </w:p>
         </w:tc>
@@ -6357,7 +6518,7 @@
               <w:rPr>
                 <w:sz w:val="18"/>
               </w:rPr>
-              <w:t>Drone America DAx8, NASA hover test [9]</w:t>
+              <w:t>Drone America DAx8, NASA hover test [10]</w:t>
             </w:r>
           </w:p>
         </w:tc>
@@ -6509,7 +6670,7 @@
               <w:rPr>
                 <w:sz w:val="18"/>
               </w:rPr>
-              <w:t>SUI Endurance, NASA hover test [9]</w:t>
+              <w:t>SUI Endurance, NASA hover test [10]</w:t>
             </w:r>
           </w:p>
         </w:tc>
@@ -6661,8 +6822,7 @@
               <w:rPr>
                 <w:sz w:val="18"/>
               </w:rPr>
-              <w:lastRenderedPageBreak/>
-              <w:t>DJI Matrice 30 [10]</w:t>
+              <w:t>DJI Matrice 30 [11]</w:t>
             </w:r>
           </w:p>
         </w:tc>
@@ -6820,7 +6980,7 @@
               <w:rPr>
                 <w:sz w:val="18"/>
               </w:rPr>
-              <w:t>DJI Matrice 4 [16]</w:t>
+              <w:t>DJI Matrice 4 [17]</w:t>
             </w:r>
           </w:p>
         </w:tc>
@@ -6978,7 +7138,7 @@
               <w:rPr>
                 <w:sz w:val="18"/>
               </w:rPr>
-              <w:t>DJI Mavic 3M [17]</w:t>
+              <w:t>DJI Mavic 3M [18]</w:t>
             </w:r>
           </w:p>
         </w:tc>
@@ -7139,10 +7299,7 @@
         <w:jc w:val="both"/>
       </w:pPr>
       <w:r>
-        <w:t>Fit rows compare measured electrical hover power at the test article’s own thrust and rotor size. Check rows were held out of the fit and compare published hover endurance at the manufacturer’s stated discharge condition, which does not include the 20 percent mission reserve used elsewhere in this paper. The DAx8 and Endurance were hover-tested inside the wind-tunnel test section, where recirculation was not quantified; the other three NASA articles were tested in a laboratory about 30 ft from the nearest w</w:t>
-      </w:r>
-      <w:r>
-        <w:t>all [18]. The DJI Matrice 350 was excluded because its published 55 minutes is forward flight at about 8 m/s rather than hover. The rotor diameters for the three check aircraft are derived from the published propeller designation rather than quoted directly.</w:t>
+        <w:t>Fit rows compare measured electrical hover power at the test article’s own thrust and rotor size. Check rows were held out of the fit and compare published hover endurance at the manufacturer’s stated discharge condition, which does not include the 20 percent mission reserve used elsewhere in this paper. The DAx8 and Endurance were hover-tested inside the wind-tunnel test section, where recirculation was not quantified; the other three NASA articles were tested in a laboratory about 30 ft from the nearest wall [19]. The DJI Matrice 350 was excluded because its published 55 minutes is forward flight at about 8 m/s rather than hover. The rotor diameters for the three check aircraft are derived from the published propeller designation rather than quoted directly.</w:t>
       </w:r>
     </w:p>
     <w:p>
@@ -7151,7 +7308,7 @@
         <w:jc w:val="both"/>
       </w:pPr>
       <w:r>
-        <w:t xml:space="preserve">The hover calibration estimates one aggregate coefficient from five NASA test points [9]. For each point, ideal induced power uses the measured supported thrust and that test article’s total rotor disk area. Measured electrical power is voltage multiplied by the sum of motor currents. An unweighted least-squares fit through the origin gives </w:t>
+        <w:t xml:space="preserve">The hover calibration estimates one aggregate coefficient from five NASA test points [10]. For each point, ideal induced power uses the measured supported thrust and that test article’s total rotor disk area. Measured electrical power is voltage multiplied by the sum of motor currents. An unweighted least-squares fit through the origin gives </w:t>
       </w:r>
       <m:oMath>
         <m:sSub>
@@ -7276,10 +7433,7 @@
         </m:r>
       </m:oMath>
       <w:r>
-        <w:t xml:space="preserve"> </w:t>
-      </w:r>
-      <w:r>
-        <w:t xml:space="preserve">parameter of 0.620274. The fit identifies their combined effect, not an independently measured rotor figure of merit. Its residuals range from </w:t>
+        <w:t xml:space="preserve"> parameter of 0.620274. The fit identifies their combined effect, not an independently measured rotor figure of merit. Its residuals range from </w:t>
       </w:r>
       <m:oMath>
         <m:r>
@@ -7319,10 +7473,7 @@
         </m:r>
       </m:oMath>
       <w:r>
-        <w:t xml:space="preserve"> </w:t>
-      </w:r>
-      <w:r>
-        <w:t>percent. Because the fit passes through the origin, each point’s influence scales with the square of its ideal power, and the DAx8 carries 79 percent of that weight. Refitting to any single point moves the reference boundaries of Section 4 to between 33.0 and 49.2 minutes (rotor limit) and between 41.2 and 61.3 minutes (energy-slope crossing). The Phantom 3 and Endurance points, whose disk loadings of 67 and 63 N/m</w:t>
+        <w:t xml:space="preserve"> percent. Because the fit passes through the origin, each point’s influence scales with the square of its ideal power, and the DAx8 carries 79 percent of that weight. Refitting to any single point moves the reference boundaries of Section 4 to between 33.0 and 49.2 minutes (rotor limit) and between 41.2 and 61.3 minutes (energy-slope crossing). The Phantom 3 and Endurance points, whose disk loadings of 67 and 63 N/m</w:t>
       </w:r>
       <m:oMath>
         <m:sSup>
@@ -7352,13 +7503,7 @@
         </m:sSup>
       </m:oMath>
       <w:r>
-        <w:t xml:space="preserve"> </w:t>
-      </w:r>
-      <w:r>
-        <w:t>are nearest the reference value, set both ends of that range. Other defensible estimators (mean ratio, geometric mean, quadrotors only) give 41.4 to 44.6 and 51.5 to 55.6 minutes. The two highest-leverage points were also the two tested inside the wind tunnel [18]. The fit treats the DAx8 as eight separate 11 in disks; the sources consulted do not state its rotor arrangement. If its rotors were coaxial pairs with four effective disks, the refit boundaries would rise to 58.8 and 73.5 minutes, although the im</w:t>
-      </w:r>
-      <w:r>
-        <w:t>plied DAx8 hover factor of 0.63 would then be well above that of the four quadrotors. Since interference between stacked rotors should lower that factor rather than raise it, this result argues for the eight-disk treatment used here.</w:t>
+        <w:t xml:space="preserve"> are nearest the reference value, set both ends of that range. Other defensible estimators (mean ratio, geometric mean, quadrotors only) give 41.4 to 44.6 and 51.5 to 55.6 minutes. The two highest-leverage points were also the two tested inside the wind tunnel [19]. The fit treats the DAx8 as eight separate 11 in disks; the sources consulted do not state its rotor arrangement. If its rotors were coaxial pairs with four effective disks, the refit boundaries would rise to 58.8 and 73.5 minutes, although the implied DAx8 hover factor of 0.63 would then be well above that of the four quadrotors. Since interference between stacked rotors should lower that factor rather than raise it, this result argues for the eight-disk treatment used here.</w:t>
       </w:r>
     </w:p>
     <w:p>
@@ -7367,13 +7512,7 @@
         <w:jc w:val="both"/>
       </w:pPr>
       <w:r>
-        <w:t>The structural intercept is inferred separately from the NASA conceptual-design mass breakdown [7]. That breakdown describes a sized baseline design rather than a weighed vehicle: its 1.61 lb airframe comes from a fuselage weight trend plus motor-support and landing-gear fractions. The calculation reproduces its airframe allowance after subtracting the present model’s structural growth and disk-area terms. Several carried masses in that subtraction are model allowances. The resulting 0.163173 kg is therefor</w:t>
-      </w:r>
-      <w:r>
-        <w:t>e conditional on those choices; it is not a directly measured empty-airframe mass or a separately validated structural law. The reference specific energy, 192.117 Wh/kg, comes from the published TB30 pack energy divided by its mass [10]. That reference does not establish the assumed 900 W/kg continuous power capability for a selected relay battery. It is also the lowest pack value among the check aircraft. The Matrice 4 pack stores 99.5 Wh in 401 g, or 248 Wh/kg [16], and using that value moves the two carr</w:t>
-      </w:r>
-      <w:r>
-        <w:t>ier boundaries to 54.4 and 67.7 minutes.</w:t>
+        <w:t>The structural intercept is inferred separately from the NASA conceptual-design mass breakdown [7]. That breakdown describes a sized baseline design rather than a weighed vehicle: its 1.61 lb airframe comes from a fuselage weight trend plus motor-support and landing-gear fractions. The calculation reproduces its airframe allowance after subtracting the present model’s structural growth and disk-area terms. Several carried masses in that subtraction are model allowances. The resulting 0.163173 kg is therefore conditional on those choices; it is not a directly measured empty-airframe mass or a separately validated structural law. The reference specific energy, 192.117 Wh/kg, comes from the published TB30 pack energy divided by its mass [11]. That reference does not establish the assumed 900 W/kg continuous power capability for a selected relay battery. It is also the lowest pack value among the check aircraft. The Matrice 4 pack stores 99.5 Wh in 401 g, or 248 Wh/kg [17], and using that value moves the two carrier boundaries to 54.4 and 67.7 minutes.</w:t>
       </w:r>
     </w:p>
     <w:p>
@@ -7382,7 +7521,7 @@
         <w:jc w:val="both"/>
       </w:pPr>
       <w:r>
-        <w:t xml:space="preserve">Three commercial quadrotors are excluded from the five-point fit and used for a separate hover-time comparison [10], [16], [17]. Their own mass, rotor area, and nominal battery energy enter the calibrated power relation, with a common assumed 25 W auxiliary load. The calculation uses the published maximum-hover discharge condition without the relay mission’s depth-of-discharge and reserve reductions. Differences range from </w:t>
+        <w:t xml:space="preserve">Three commercial quadrotors are excluded from the five-point fit and used for a separate hover-time comparison [11], [17], [18]. Their own mass, rotor area, and nominal battery energy enter the calibrated power relation, with a common assumed 25 W auxiliary load. The calculation uses the published maximum-hover discharge condition without the relay mission’s depth-of-discharge and reserve reductions. Differences range from </w:t>
       </w:r>
       <m:oMath>
         <m:r>
@@ -7422,10 +7561,7 @@
         </m:r>
       </m:oMath>
       <w:r>
-        <w:t xml:space="preserve"> </w:t>
-      </w:r>
-      <w:r>
-        <w:t xml:space="preserve">percent (Table 3 and Figure 2). The auxiliary allowance matters for the two smaller aircraft. With 0, 10, and 40 W instead of 25 W, the Matrice 30, Matrice 4, and Mavic 3M differences become </w:t>
+        <w:t xml:space="preserve"> percent (Table 3 and Figure 3). The auxiliary allowance matters for the two smaller aircraft. With 0, 10, and 40 W instead of 25 W, the Matrice 30, Matrice 4, and Mavic 3M differences become </w:t>
       </w:r>
       <m:oMath>
         <m:r>
@@ -7605,13 +7741,7 @@
         </m:r>
       </m:oMath>
       <w:r>
-        <w:t xml:space="preserve"> </w:t>
-      </w:r>
-      <w:r>
-        <w:t>percent. Only the Matrice 30, whose hover power is large relative to the allowance, stays within 10 percent across that range. The two smaller aircraft are therefore consistent with the fitted relation rather than an independent test of it. The Matrice 350 figure is excluded because it describes forward flight. These comparisons provide a limited consistency check on hover power and energy accounting. They do not test the structural mass model, flight control, or a physical relay aircraft, and three publish</w:t>
-      </w:r>
-      <w:r>
-        <w:t>ed values do not establish a general prediction-error bound.</w:t>
+        <w:t xml:space="preserve"> percent. Only the Matrice 30, whose hover power is large relative to the allowance, stays within 10 percent across that range. The two smaller aircraft are therefore consistent with the fitted relation rather than an independent test of it. The Matrice 350 figure is excluded because it describes forward flight. These comparisons provide a limited consistency check on hover power and energy accounting. They do not test the structural mass model, flight control, or a physical relay aircraft, and three published values do not establish a general prediction-error bound.</w:t>
       </w:r>
     </w:p>
     <w:p>
@@ -7638,12 +7768,11 @@
         <w:rPr>
           <w:noProof/>
         </w:rPr>
-        <w:lastRenderedPageBreak/>
         <w:drawing>
-          <wp:inline distT="0" distB="0" distL="0" distR="0" wp14:anchorId="5D6FB410" wp14:editId="215BA980">
+          <wp:inline distT="0" distB="0" distL="0" distR="0" wp14:anchorId="21DA3CA2" wp14:editId="21DA3CA3">
             <wp:extent cx="6400800" cy="2601980"/>
             <wp:effectExtent l="0" t="0" r="0" b="0"/>
-            <wp:docPr id="2" name="Picture 2"/>
+            <wp:docPr id="3" name="Picture 3"/>
             <wp:cNvGraphicFramePr>
               <a:graphicFrameLocks xmlns:a="http://schemas.openxmlformats.org/drawingml/2006/main" noChangeAspect="1"/>
             </wp:cNvGraphicFramePr>
@@ -7655,7 +7784,7 @@
                     <pic:cNvPicPr/>
                   </pic:nvPicPr>
                   <pic:blipFill>
-                    <a:blip r:embed="rId9"/>
+                    <a:blip r:embed="rId10"/>
                     <a:stretch>
                       <a:fillRect/>
                     </a:stretch>
@@ -7684,7 +7813,7 @@
         <w:rPr>
           <w:b/>
         </w:rPr>
-        <w:t>Figure 2. Hover evidence shown on separate axes. Left: measured and fitted electrical powers for the five NASA points. Right: published and calculated maximum-hover times for three aircraft excluded from the fit. A diagonal indicates agreement; neither panel validates carrier mass closure.</w:t>
+        <w:t>Figure 3. Hover evidence shown on separate axes. Left: measured and fitted electrical powers for the five NASA points. Right: published and calculated maximum-hover times for three aircraft excluded from the fit. A diagonal indicates agreement; neither panel validates carrier mass closure.</w:t>
       </w:r>
     </w:p>
     <w:p>
@@ -7707,7 +7836,6 @@
       <w:bookmarkStart w:id="13" w:name="size-limits-and-decision-order"/>
       <w:bookmarkEnd w:id="12"/>
       <w:r>
-        <w:lastRenderedPageBreak/>
         <w:t>Size Limits and Decision Order</w:t>
       </w:r>
     </w:p>
@@ -7810,13 +7938,7 @@
                     <w:rPr>
                       <w:rFonts w:ascii="Cambria Math" w:hAnsi="Cambria Math"/>
                     </w:rPr>
-                    <m:t>4</m:t>
-                  </m:r>
-                  <m:r>
-                    <w:rPr>
-                      <w:rFonts w:ascii="Cambria Math" w:hAnsi="Cambria Math"/>
-                    </w:rPr>
-                    <m:t>A</m:t>
+                    <m:t>4A</m:t>
                   </m:r>
                 </m:num>
                 <m:den>
@@ -7869,10 +7991,7 @@
         <w:jc w:val="both"/>
       </w:pPr>
       <w:r>
-        <w:t>Each case then receives one label from the first check that fails. If the direct path passes the assumed service screen, the case is direct: relay benefit is not required by this criterion. Otherwise, if either relay hop is blocked or short of margin, the case is link fail. Otherwise, if the aircraft has no solution, the case is no solution, and if it has a solution outside the size limits, the case is too large. What remains is a pass, meaning a blocked or insufficient direct path, two passing outbound rel</w:t>
-      </w:r>
-      <w:r>
-        <w:t>ay hops, and a finite carrier within the exploratory limits. Because connectivity is checked first, a link fail label can hide an aircraft failure in the same case, so the case records keep both flags.</w:t>
+        <w:t>Each case then receives one label from the first check that fails. If the direct path passes the assumed service screen, the case is direct: relay benefit is not required by this criterion. Otherwise, if either relay hop is blocked or short of margin, the case is link fail. Otherwise, if the aircraft has no solution, the case is no solution, and if it has a solution outside the size limits, the case is too large. What remains is a pass, meaning a blocked or insufficient direct path, two passing outbound relay hops, and a finite carrier within the exploratory limits. Because connectivity is checked first, a link fail label can hide an aircraft failure in the same case, so the case records keep both flags.</w:t>
       </w:r>
     </w:p>
     <w:p>
@@ -7900,10 +8019,7 @@
         <w:jc w:val="both"/>
       </w:pPr>
       <w:r>
-        <w:t xml:space="preserve">The repository carries 25 automated tests covering a hand-calculated hover case, the branch logic, the label order, the calibration script, and the two boundary calculations. A separate checker rebuilds every link from coordinates and solves the mass balance by bisection without using the production solver, then compares all saved records. All tests and checks pass at the commit cited in the Data Availability section. These confirm that the numbers follow from the stated equations. They do not confirm that </w:t>
-      </w:r>
-      <w:r>
-        <w:t>a physical aircraft behaves this way.</w:t>
+        <w:t>The repository carries 35 automated tests covering a hand-calculated hover case, branch logic, label order, calibration, and boundary calculations. A separate checker rebuilds every link from coordinates and solves the mass balance by bisection without using the production solver, then compares all saved records. The tests and checks pass at the commit cited in the Data Availability section. They confirm that the numbers follow from the stated equations. They do not establish physical aircraft behavior.</w:t>
       </w:r>
     </w:p>
     <w:p>
@@ -7918,10 +8034,10 @@
           <w:noProof/>
         </w:rPr>
         <w:drawing>
-          <wp:inline distT="0" distB="0" distL="0" distR="0" wp14:anchorId="54824540" wp14:editId="24A79978">
+          <wp:inline distT="0" distB="0" distL="0" distR="0" wp14:anchorId="21DA3CA4" wp14:editId="21DA3CA5">
             <wp:extent cx="3086100" cy="5851608"/>
             <wp:effectExtent l="0" t="0" r="0" b="0"/>
-            <wp:docPr id="3" name="Picture 3"/>
+            <wp:docPr id="4" name="Picture 4"/>
             <wp:cNvGraphicFramePr>
               <a:graphicFrameLocks xmlns:a="http://schemas.openxmlformats.org/drawingml/2006/main" noChangeAspect="1"/>
             </wp:cNvGraphicFramePr>
@@ -7933,7 +8049,7 @@
                     <pic:cNvPicPr/>
                   </pic:nvPicPr>
                   <pic:blipFill>
-                    <a:blip r:embed="rId10"/>
+                    <a:blip r:embed="rId11"/>
                     <a:stretch>
                       <a:fillRect/>
                     </a:stretch>
@@ -7962,7 +8078,7 @@
         <w:rPr>
           <w:b/>
         </w:rPr>
-        <w:t>Figure 3. Baseline results for the 90 primary cases. P means the relay helps and the aircraft stays within the screening limits, S marks a solution outside those limits, NC marks a case with no solution, and L marks the earlier link check. All cells in the 60 m panel fail visibility. Link failures in the 120 m and 240 m panels are clear but short of margin. No case in the baseline is direct-sufficient.</w:t>
+        <w:t>Figure 4. Baseline results for the 90 primary cases. P means the relay helps and the aircraft stays within the screening limits, S marks a solution outside those limits, NC marks a case with no solution, and L marks the earlier link check. All cells in the 60 m panel fail visibility. Link failures in the 120 m and 240 m panels are clear but short of margin. No case in the baseline is direct-sufficient.</w:t>
       </w:r>
     </w:p>
     <w:p>
@@ -7970,7 +8086,7 @@
         <w:pStyle w:val="Heading1"/>
       </w:pPr>
       <w:bookmarkStart w:id="15" w:name="results"/>
-      <w:bookmarkStart w:id="16" w:name="_Toc241065244"/>
+      <w:bookmarkStart w:id="16" w:name="_Toc241070100"/>
       <w:bookmarkEnd w:id="6"/>
       <w:bookmarkEnd w:id="14"/>
       <w:r>
@@ -7993,11 +8109,7 @@
         <w:jc w:val="both"/>
       </w:pPr>
       <w:r>
-        <w:t xml:space="preserve">For a midpoint relay at 120 m, solving the zero-margin condition gives a maximum endpoint separation of 25.0 km under the baseline RF assumptions. The ground-to-relay hop binds first. A 12 dB excess-loss allowance reduces that separation to 6.3 km. Both statements require a clear path. </w:t>
-      </w:r>
-      <w:r>
-        <w:lastRenderedPageBreak/>
-        <w:t>Dwell has no effect on this boundary because time does not enter the link model.</w:t>
+        <w:t>For a midpoint relay at 120 m, solving the zero-margin condition gives a maximum endpoint separation of 25.0 km under the baseline RF assumptions. The ground-to-relay hop binds first. A 12 dB excess-loss allowance reduces that separation to 6.3 km. Both statements require a clear path. Dwell has no effect on this boundary because time does not enter the link model.</w:t>
       </w:r>
     </w:p>
     <w:p>
@@ -8006,7 +8118,7 @@
         <w:jc w:val="both"/>
       </w:pPr>
       <w:r>
-        <w:t>The reference carrier reaches the 0.75 m rotor limit at 42.1 minutes. At that point gross mass is 10.81 kg, so the rotor limit is tighter than the 15 kg mass ceiling. Finite closure persists until the energy-branch slope reaches one at 52.4 minutes. Thus the interval between these boundaries contains finite mathematical sizes that fail the physical screen. Figure 4 shows this transition without treating the divergent branch as a buildable aircraft.</w:t>
+        <w:t>The reference carrier reaches the 0.75 m rotor limit at 42.1 minutes. At that point gross mass is 10.81 kg, so the rotor limit is tighter than the 15 kg mass ceiling. Finite closure persists until the energy-branch slope reaches one at 52.4 minutes. Thus the interval between these boundaries contains finite mathematical sizes that fail the physical screen. Figure 5 shows this transition without treating the divergent branch as a buildable aircraft.</w:t>
       </w:r>
     </w:p>
     <w:p>
@@ -8030,10 +8142,10 @@
           <w:noProof/>
         </w:rPr>
         <w:drawing>
-          <wp:inline distT="0" distB="0" distL="0" distR="0" wp14:anchorId="4CB755AD" wp14:editId="305EB9D2">
-            <wp:extent cx="3086100" cy="2513153"/>
+          <wp:inline distT="0" distB="0" distL="0" distR="0" wp14:anchorId="21DA3CA6" wp14:editId="21DA3CA7">
+            <wp:extent cx="2834640" cy="2308378"/>
             <wp:effectExtent l="0" t="0" r="0" b="0"/>
-            <wp:docPr id="4" name="Picture 4"/>
+            <wp:docPr id="5" name="Picture 5"/>
             <wp:cNvGraphicFramePr>
               <a:graphicFrameLocks xmlns:a="http://schemas.openxmlformats.org/drawingml/2006/main" noChangeAspect="1"/>
             </wp:cNvGraphicFramePr>
@@ -8045,7 +8157,7 @@
                     <pic:cNvPicPr/>
                   </pic:nvPicPr>
                   <pic:blipFill>
-                    <a:blip r:embed="rId11"/>
+                    <a:blip r:embed="rId12"/>
                     <a:stretch>
                       <a:fillRect/>
                     </a:stretch>
@@ -8053,7 +8165,7 @@
                   <pic:spPr>
                     <a:xfrm>
                       <a:off x="0" y="0"/>
-                      <a:ext cx="3086100" cy="2513153"/>
+                      <a:ext cx="2834640" cy="2308378"/>
                     </a:xfrm>
                     <a:prstGeom prst="rect">
                       <a:avLst/>
@@ -8074,7 +8186,7 @@
         <w:rPr>
           <w:b/>
         </w:rPr>
-        <w:t>Figure 4. Reference carrier mass versus dwell, evaluated from the stated branch equations. The rotor screen binds at 42.1 minutes; the energy slope reaches one at 52.4 minutes. The plotted finite curve is clipped at 25 kg for readability.</w:t>
+        <w:t>Figure 5. Reference carrier mass versus dwell, evaluated from the stated branch equations. The rotor screen binds at 42.1 minutes; the energy slope reaches one at 52.4 minutes. The plotted finite curve is clipped at 25 kg for readability.</w:t>
       </w:r>
     </w:p>
     <w:p>
@@ -8890,10 +9002,7 @@
         <w:jc w:val="both"/>
       </w:pPr>
       <w:r>
-        <w:t>The worked case fixes the geometry and varies only dwell, which isolates the aircraft behavior. At 10 km separation the screen stands 4 km from the ground endpoint. The direct line passes it at 40 m, below the 80 m top, so the direct path is blocked. With the relay at 120 m the first hop passes the screen at 96 m and is clear, as Figure 1(b) shows. The two hop margins are 7.97 and 10.02 dB, and they do not change with dwell. This is what makes the case useful: every difference that follows belongs to the ai</w:t>
-      </w:r>
-      <w:r>
-        <w:t>rcraft. The saved record also lists a 5.96 dB direct margin, which is the margin the direct path would have if the screen were not there.</w:t>
+        <w:t>The worked case fixes the geometry and varies only dwell, which isolates the aircraft behavior. At 10 km separation the screen stands 4 km from the ground endpoint. The direct line passes it at 40 m, below the 80 m top, so the direct path is blocked. With the relay at 120 m the first hop passes the screen at 96 m and is clear, as Figure 1(b) shows. The two hop margins are 7.97 and 10.02 dB, and they do not change with dwell. This is what makes the case useful: every difference that follows belongs to the aircraft. The saved record also lists a 5.96 dB direct margin, which is the margin the direct path would have if the screen were not there.</w:t>
       </w:r>
     </w:p>
     <w:p>
@@ -8902,13 +9011,7 @@
         <w:jc w:val="both"/>
       </w:pPr>
       <w:r>
-        <w:t>Table 4 shows what changes instead. At 10 and 20 minutes the pack is sized by peak power rather than by energy. This means both cases close at the same 3.58 kg, and the installed 231 Wh exceeds the 99 and 198 Wh of pack capacity those dwells require under the same reserve and depth-of-discharge policy. At 30 minutes energy takes over, the aircraft closes at 4.77 kg with a 0.50 m rotor, and the battery reaches 42 percent of gross mass. At 45 minutes the growth factor is 0.885 and the aircraft still closes, b</w:t>
-      </w:r>
-      <w:r>
-        <w:t>ut at 15.1 kg with a 0.89 m rotor, which fails both size limits. At 60 minutes the growth factor passes one and there is no solution to report at all. The last two rows are the two failure stages from Section 3 seen in one geometry. The short-dwell masses can be compared with the check aircraft. Under the same fitted relation, fixed loads, and usable fraction, a Matrice 30 carrying the payload weighs 3.97 kg and a Matrice 4 weighs 1.42 kg, and both hover for about 22 minutes against the 3.58 kg, 20-minute r</w:t>
-      </w:r>
-      <w:r>
-        <w:t>eference result. The reference family is therefore deliberately heavy at short dwell, since its 1.116 kg of fixed allowances exceeds the whole takeoff mass of a Matrice 4 and its pack is sized by peak power rather than by energy.</w:t>
+        <w:t>Table 4 shows what changes instead. At 10 and 20 minutes the pack is sized by peak power rather than by energy. This means both cases close at the same 3.58 kg, and the installed 231 Wh exceeds the 99 and 198 Wh of pack capacity those dwells require under the same reserve and depth-of-discharge policy. At 30 minutes energy takes over, the aircraft closes at 4.77 kg with a 0.50 m rotor, and the battery reaches 42 percent of gross mass. At 45 minutes the growth factor is 0.885 and the aircraft still closes, but at 15.1 kg with a 0.89 m rotor, which fails both size limits. At 60 minutes the growth factor passes one and there is no solution to report at all. The last two rows are the two failure stages from Section 3 seen in one geometry. The short-dwell masses can be compared with the check aircraft. Under the same fitted relation, fixed loads, and usable fraction, a Matrice 30 carrying the payload weighs 3.97 kg and a Matrice 4 weighs 1.42 kg, and both hover for about 22 minutes against the 3.58 kg, 20-minute reference result. The reference family is therefore deliberately heavy at short dwell, since its 1.116 kg of fixed allowances exceeds the whole takeoff mass of a Matrice 4 and its pack is sized by peak power rather than by energy.</w:t>
       </w:r>
     </w:p>
     <w:p>
@@ -8927,14 +9030,7 @@
         <w:jc w:val="both"/>
       </w:pPr>
       <w:r>
-        <w:t>The 90-case grid shows where those two limits fall across the sampled points. Of the 90 baseline cases, 18 pass, 6 are too large, 6 have no solution, and 60 fail the link check. Figure 3 shows the pattern. Every case at 60 m fails because the relay sits below the 100 m clearance threshold. At 120 and 240 m the 5, 10, and 20 km cases clear the screen and hold margin. Within those cases the 10 to 30 minute dwells pass, the 45 minute dwells are too large, and the 60 minute dwells have no solution. At 30 km and</w:t>
-      </w:r>
-      <w:r>
-        <w:t xml:space="preserve"> beyond the relay can </w:t>
-      </w:r>
-      <w:r>
-        <w:lastRenderedPageBreak/>
-        <w:t>see both endpoints but the first hop falls short of margin, which matches the 25.0 km limit from Section 4.</w:t>
+        <w:t>The 90-case grid shows where those two limits fall across the sampled points. Of the 90 baseline cases, 18 pass, 6 are too large, 6 have no solution, and 60 fail the link check. Figure 4 shows the pattern. Every case at 60 m fails because the relay sits below the 100 m clearance threshold. At 120 and 240 m the 5, 10, and 20 km cases clear the screen and hold margin. Within those cases the 10 to 30 minute dwells pass, the 45 minute dwells are too large, and the 60 minute dwells have no solution. At 30 km and beyond the relay can see both endpoints but the first hop falls short of margin, which matches the 25.0 km limit from Section 4.</w:t>
       </w:r>
     </w:p>
     <w:p>
@@ -8943,10 +9039,7 @@
         <w:jc w:val="both"/>
       </w:pPr>
       <w:r>
-        <w:t>Neither check alone gives the same answer as both together. In the baseline scenario 30 of the 90 cases pass the link check and 54 pass the aircraft check, but only 18 pass both. The 54 aircraft passes include 36 cases where no usable link exists. This leaves the 30 link passes, of which 12 have an aircraft that is too large or has no solution. The separate counts answer different questions. Their intersection identifies the 18 cases that satisfy both; the counts are deterministic grid totals and give neith</w:t>
-      </w:r>
-      <w:r>
-        <w:t>er probabilities nor a comparison of prediction accuracy.</w:t>
+        <w:t>Neither check alone gives the same answer as both together. In the baseline scenario 30 of the 90 cases pass the link check and 54 pass the aircraft check, but only 18 pass both. The 54 aircraft passes include 36 cases where no usable link exists. This leaves the 30 link passes, of which 12 have an aircraft that is too large or has no solution. The separate counts answer different questions. Their intersection identifies the 18 cases that satisfy both; the counts are deterministic grid totals and give neither probabilities nor a comparison of prediction accuracy.</w:t>
       </w:r>
     </w:p>
     <w:p>
@@ -9023,10 +9116,7 @@
         <w:jc w:val="both"/>
       </w:pPr>
       <w:r>
-        <w:t>Moving the screen changes the clearance threshold in (1) and therefore changes which altitude layers work. Figure 5 shows the five thresholds. Lowering the screen to 60 m or moving it to 0.45 of the span drops the threshold to 75.0 and 88.9 m. This leaves the sampled results unchanged, since 60 m is still blocked and 120 m is still clear. Raising the screen to 100 m or moving it to 0.30 of the span raises the threshold to 125.0 and 133.3 m. This blocks the 120 m layer and halves the passes to 9. While the t</w:t>
-      </w:r>
-      <w:r>
-        <w:t>wo lower thresholds produce no change at all, that is a statement about the sampled altitudes rather than evidence of insensitivity, since no altitude between 75 and 120 m was tested.</w:t>
+        <w:t>Moving the screen changes the clearance threshold in (1) and therefore changes which altitude layers work. Figure 6 shows the five thresholds. Lowering the screen to 60 m or moving it to 0.45 of the span drops the threshold to 75.0 and 88.9 m. This leaves the sampled results unchanged, since 60 m is still blocked and 120 m is still clear. Raising the screen to 100 m or moving it to 0.30 of the span raises the threshold to 125.0 and 133.3 m. This blocks the 120 m layer and halves the passes to 9. While the two lower thresholds produce no change at all, that is a statement about the sampled altitudes rather than evidence of insensitivity, since no altitude between 75 and 120 m was tested.</w:t>
       </w:r>
     </w:p>
     <w:p>
@@ -9050,10 +9140,10 @@
           <w:noProof/>
         </w:rPr>
         <w:drawing>
-          <wp:inline distT="0" distB="0" distL="0" distR="0" wp14:anchorId="3D0B7D50" wp14:editId="7CD33F99">
+          <wp:inline distT="0" distB="0" distL="0" distR="0" wp14:anchorId="21DA3CA8" wp14:editId="21DA3CA9">
             <wp:extent cx="3086100" cy="2684628"/>
             <wp:effectExtent l="0" t="0" r="0" b="0"/>
-            <wp:docPr id="5" name="Picture 5"/>
+            <wp:docPr id="6" name="Picture 6"/>
             <wp:cNvGraphicFramePr>
               <a:graphicFrameLocks xmlns:a="http://schemas.openxmlformats.org/drawingml/2006/main" noChangeAspect="1"/>
             </wp:cNvGraphicFramePr>
@@ -9065,7 +9155,7 @@
                     <pic:cNvPicPr/>
                   </pic:nvPicPr>
                   <pic:blipFill>
-                    <a:blip r:embed="rId12"/>
+                    <a:blip r:embed="rId13"/>
                     <a:stretch>
                       <a:fillRect/>
                     </a:stretch>
@@ -9094,7 +9184,7 @@
         <w:rPr>
           <w:b/>
         </w:rPr>
-        <w:t>Figure 5. Relay height at which the first hop begins to clear, for the five screen cases. Thresholds above 120 m remove that altitude layer from service, while changes that stay between 60 and 120 m leave the sampled results unchanged. This comparison is geometric; no terrain model underlies it.</w:t>
+        <w:t>Figure 6. Relay height at which the first hop begins to clear, for the five screen cases. Thresholds above 120 m remove that altitude layer from service, while changes that stay between 60 and 120 m leave the sampled results unchanged. This comparison is geometric; no terrain model underlies it.</w:t>
       </w:r>
     </w:p>
     <w:p>
@@ -9102,7 +9192,7 @@
         <w:pStyle w:val="Heading1"/>
       </w:pPr>
       <w:bookmarkStart w:id="21" w:name="discussion"/>
-      <w:bookmarkStart w:id="22" w:name="_Toc241065245"/>
+      <w:bookmarkStart w:id="22" w:name="_Toc241070101"/>
       <w:bookmarkEnd w:id="15"/>
       <w:bookmarkEnd w:id="20"/>
       <w:r>
@@ -9125,7 +9215,7 @@
         <w:jc w:val="both"/>
       </w:pPr>
       <w:r>
-        <w:t>The labels point to different parts of the architecture. A connectivity failure calls for reconsidering geometry or the link budget. More battery cannot repair that failure while the RF assumptions remain fixed. A finite result outside the size screen calls for reconsidering dwell, carrier assumptions, or the permitted physical envelope. Mathematical nonclosure means the assumed battery, power, and mass relationship has no solution; relaxing a mass ceiling cannot create one.</w:t>
+        <w:t>The labels point to different parts of the architecture. A connectivity failure calls for reconsidering relay placement, radio assumptions, or the service requirement. More battery cannot repair that failure while the RF assumptions remain fixed. A finite result outside the size screen calls for reconsidering dwell or the carrier’s battery, propulsion, and structural allowances. Mathematical nonclosure means those resource relations have no finite solution under the assumed scaling; relaxing a mass ceiling cannot create one. The separate carrier command path and payload mount also need interface and physical tests before the allocation can become a verified design.</w:t>
       </w:r>
     </w:p>
     <w:p>
@@ -9143,7 +9233,7 @@
         <w:jc w:val="both"/>
       </w:pPr>
       <w:r>
-        <w:t>The calculations also show the limits of the coupling. The payload supplies common mass, DC, and RF assumptions, but link margin does not resize the radio and altitude does not change the fixed-density hover calculation. Consequently, the case supports an architecture screening decision without solving a joint radio, trajectory, and vehicle optimization. For a systems engineering reader, its useful output is a traceable chain from the requested service to the resource or link assumption that limits it.</w:t>
+        <w:t>The payload supplies common mass, DC, and RF assumptions to the two checks. Link margin does not resize the radio, and altitude does not change the fixed-density hover calculation. Consequently, the assessment can identify which allocation or resource binds without optimizing the radio, trajectory, and aircraft together. The trace from requested service to limiting assumption is the principal architecture result.</w:t>
       </w:r>
     </w:p>
     <w:p>
@@ -9153,7 +9243,6 @@
       <w:bookmarkStart w:id="24" w:name="limitations"/>
       <w:bookmarkEnd w:id="23"/>
       <w:r>
-        <w:lastRenderedPageBreak/>
         <w:t>Limitations</w:t>
       </w:r>
     </w:p>
@@ -9163,13 +9252,7 @@
         <w:jc w:val="both"/>
       </w:pPr>
       <w:r>
-        <w:t xml:space="preserve">The carrier result depends on a resized family with constant disk loading, aggregate hover efficiency, and parametric component masses. The five-point fit provides evidence for an aggregate power coefficient over those test conditions. It does not resolve scale effects, rotor interference, or environmental variation for the proposed carrier. The least-squares fit also gives greater numerical influence to high-power observations, so the DAx8 dominates it, and that point and the Endurance point were measured </w:t>
-      </w:r>
-      <w:r>
-        <w:t>in the tunnel with unquantified recirculation. The spread of single-point fits, 33 to 49 minutes for the rotor-limit boundary, is a better statement of the hover-model uncertainty than the fitted value alone, and it exceeds the effect of any other estimator choice. The reference case includes no operating-condition margin beyond the laboratory calibration. The commercial hover comparisons use nominal energy and a common auxiliary-load allowance; their small discrepancies could include compensating assumptio</w:t>
-      </w:r>
-      <w:r>
-        <w:t>ns. They should not be read as a seven-percent accuracy guarantee.</w:t>
+        <w:t>The carrier result depends on a resized family with constant disk loading, aggregate hover efficiency, and parametric component masses. The five-point fit provides evidence for an aggregate power coefficient over those test conditions. It does not resolve scale effects, rotor interference, or environmental variation for the proposed carrier. The least-squares fit also gives greater numerical influence to high-power observations, so the DAx8 dominates it, and that point and the Endurance point were measured in the tunnel with unquantified recirculation. The spread of single-point fits, 33 to 49 minutes for the rotor-limit boundary, is a better statement of the hover-model uncertainty than the fitted value alone, and it exceeds the effect of any other estimator choice. The reference case includes no operating-condition margin beyond the laboratory calibration. The commercial hover comparisons use nominal energy and a common auxiliary-load allowance; their small discrepancies could include compensating assumptions. They should not be read as a seven-percent accuracy guarantee.</w:t>
       </w:r>
     </w:p>
     <w:p>
@@ -9187,13 +9270,7 @@
         <w:jc w:val="both"/>
       </w:pPr>
       <w:r>
-        <w:t>The link calculation tests visibility and received level. It omits interference, fading, diffraction, Fresnel clearance, scheduling, duplex operation, and throughput. Two of these simplifications are conservative. An opaque screen treats a grazing path as blocked, whereas knife-edge diffraction would impose a finite loss. However, omitting Fresnel clearance works in the other direction just above the geometric threshold. In the 10 km case, keeping 60 percent of the first Fresnel zone clear at the screen rai</w:t>
-      </w:r>
-      <w:r>
-        <w:t>ses the 100 m threshold to about 108 m. This does not change the sampled results, since the 120 m layer still clears. The midpoint relay placement is also not optimal: the first hop binds, and moving the relay to 0.44 of the span balances the hops and raises the 25.0 km boundary to 28.4 km while still clearing the screen. Antenna patterns and interference could move the result in either direction. The screen scenarios are geometric constructions rather than surveyed terrain. Statistical air-to-ground blocka</w:t>
-      </w:r>
-      <w:r>
-        <w:t>ge models address different questions [19]; none is fitted or validated here. No probability of availability follows from the number of passing grid cases.</w:t>
+        <w:t>The link calculation tests visibility and received level. It omits interference, fading, diffraction, Fresnel clearance, scheduling, duplex operation, and throughput. Two of these simplifications are conservative. An opaque screen treats a grazing path as blocked, whereas knife-edge diffraction would impose a finite loss. However, omitting Fresnel clearance works in the other direction just above the geometric threshold. In the 10 km case, keeping 60 percent of the first Fresnel zone clear at the screen raises the 100 m threshold to about 108 m. This does not change the sampled results, since the 120 m layer still clears. The midpoint relay placement is also not optimal: the first hop binds, and moving the relay to 0.44 of the span balances the hops and raises the 25.0 km boundary to 28.4 km while still clearing the screen. Antenna patterns and interference could move the result in either direction. The screen scenarios are geometric constructions rather than surveyed terrain. Statistical air-to-ground blockage models address different questions [20]; none is fitted or validated here. No probability of availability follows from the number of passing grid cases.</w:t>
       </w:r>
     </w:p>
     <w:p>
@@ -9202,10 +9279,7 @@
         <w:jc w:val="both"/>
       </w:pPr>
       <w:r>
-        <w:t xml:space="preserve">Only stationary outbound dwell is calculated. Transit, climb, recovery energy, return traffic, carrier-command performance, and station keeping remain outside the quantitative assessment. A follow-on assessment would need matched power measurements, installed-payload characterization, a complete mission energy budget, and </w:t>
-      </w:r>
-      <w:r>
-        <w:t>communications measurements for the intended service. These are evidence needs for the candidate architecture; this paper does not demonstrate those capabilities.</w:t>
+        <w:t>Only stationary outbound dwell is calculated. Transit, climb, recovery energy, return traffic, carrier-command performance, and station keeping remain outside the quantitative assessment. A follow-on assessment would need matched power measurements, installed-payload characterization, a complete mission energy budget, and communications measurements for the intended service. These are evidence needs for the candidate architecture; this paper does not demonstrate those capabilities.</w:t>
       </w:r>
     </w:p>
     <w:p>
@@ -9213,7 +9287,7 @@
         <w:pStyle w:val="Heading1"/>
       </w:pPr>
       <w:bookmarkStart w:id="25" w:name="conclusions"/>
-      <w:bookmarkStart w:id="26" w:name="_Toc241065246"/>
+      <w:bookmarkStart w:id="26" w:name="_Toc241070102"/>
       <w:bookmarkEnd w:id="21"/>
       <w:bookmarkEnd w:id="24"/>
       <w:r>
@@ -9227,10 +9301,7 @@
         <w:jc w:val="both"/>
       </w:pPr>
       <w:r>
-        <w:t xml:space="preserve">A useful relay path and a supportable carrier are separate conditions for airborne service. This case study connects them through a declared payload and reports the limiting mechanism for each sampled mission. At the reference inputs, the midpoint relay has a 25.0 km link-margin boundary at 120 m height; 12 dB of added loss reduces it to 6.3 km. Carrier size reaches the exploratory rotor limit at 42.1 minutes, while mathematical closure ends at 52.4 minutes within the assumed model. These values include no </w:t>
-      </w:r>
-      <w:r>
-        <w:t>operating-condition margin, and the scatter among the individual hover calibration points alone spans 33 to 49 minutes for the first boundary.</w:t>
+        <w:t>A useful relay path depends on the payload’s mission-traffic function, while a supportable carrier depends on power and mechanical resources. This case study assigns those responsibilities, keeps aircraft command separate, and reports the limiting mechanism for each sampled mission. At the reference inputs, the midpoint relay has a 25.0 km link-margin boundary at 120 m height; 12 dB of added loss reduces it to 6.3 km. Carrier size reaches the exploratory rotor limit at 42.1 minutes, while mathematical closure ends at 52.4 minutes within the assumed model. These values include no separate operating-condition margin, and single-point hover refits span 33 to 49 minutes for the first boundary.</w:t>
       </w:r>
     </w:p>
     <w:p>
@@ -9239,10 +9310,7 @@
         <w:jc w:val="both"/>
       </w:pPr>
       <w:r>
-        <w:t>The 10 km example distinguishes a 4.77 kg, 30-minute pass from a 15.15 kg, 45-minute exclusion and a 60-minute nonclosure. Across 90 baseline cases, 18 pass both screens. The hover calibration and published-aircraft comparisons support a limited part of the calculation, while structural scaling and full-mission performance remain unverified. The proposed architecture assigns carrier command to a separate radio path and requires the aircraft to power and support the payload. The assessment gives a systems en</w:t>
-      </w:r>
-      <w:r>
-        <w:t>gineer an explainable way to identify the constraint that must change before advancing a relay concept.</w:t>
+        <w:t>The 10 km example distinguishes a 4.77 kg, 30-minute pass from a 15.15 kg, 45-minute exclusion and a 60-minute nonclosure. Across 90 baseline cases, 18 pass both screens. These outcomes call for different changes to geometry, service duration, or carrier resources. The hover calibration and published-aircraft comparisons support only part of the resource calculation. Structural scaling, the command and payload interfaces, and full-mission performance remain unverified. The workflow identifies the next engineering question without claiming a flight-ready relay.</w:t>
       </w:r>
     </w:p>
     <w:p>
@@ -9250,7 +9318,7 @@
         <w:pStyle w:val="Heading1"/>
       </w:pPr>
       <w:bookmarkStart w:id="27" w:name="Xfdd834b9a7a4ac0acbd2b385069b2ec5d4fd041"/>
-      <w:bookmarkStart w:id="28" w:name="_Toc241065247"/>
+      <w:bookmarkStart w:id="28" w:name="_Toc241070103"/>
       <w:bookmarkEnd w:id="25"/>
       <w:r>
         <w:t>Appendix A. Complete Carrier Mass Balance</w:t>
@@ -9508,13 +9576,7 @@
             <w:rPr>
               <w:rFonts w:ascii="Cambria Math" w:hAnsi="Cambria Math"/>
             </w:rPr>
-            <m:t>  </m:t>
-          </m:r>
-          <m:r>
-            <w:rPr>
-              <w:rFonts w:ascii="Cambria Math" w:hAnsi="Cambria Math"/>
-            </w:rPr>
-            <m:t>u</m:t>
+            <m:t>  u</m:t>
           </m:r>
           <m:r>
             <m:rPr>
@@ -10688,13 +10750,7 @@
                     <w:rPr>
                       <w:rFonts w:ascii="Cambria Math" w:hAnsi="Cambria Math"/>
                     </w:rPr>
-                    <m:t>m</m:t>
-                  </m:r>
-                  <m:r>
-                    <w:rPr>
-                      <w:rFonts w:ascii="Cambria Math" w:hAnsi="Cambria Math"/>
-                    </w:rPr>
-                    <m:t>0</m:t>
+                    <m:t>m0</m:t>
                   </m:r>
                 </m:sub>
               </m:sSub>
@@ -10772,13 +10828,7 @@
                 <w:rPr>
                   <w:rFonts w:ascii="Cambria Math" w:hAnsi="Cambria Math"/>
                 </w:rPr>
-                <m:t>F</m:t>
-              </m:r>
-              <m:r>
-                <w:rPr>
-                  <w:rFonts w:ascii="Cambria Math" w:hAnsi="Cambria Math"/>
-                </w:rPr>
-                <m:t>&amp;</m:t>
+                <m:t>F&amp;</m:t>
               </m:r>
               <m:r>
                 <m:rPr>
@@ -11279,13 +11329,7 @@
                 <w:rPr>
                   <w:rFonts w:ascii="Cambria Math" w:hAnsi="Cambria Math"/>
                 </w:rPr>
-                <m:t>s</m:t>
-              </m:r>
-              <m:r>
-                <w:rPr>
-                  <w:rFonts w:ascii="Cambria Math" w:hAnsi="Cambria Math"/>
-                </w:rPr>
-                <m:t>0</m:t>
+                <m:t>s0</m:t>
               </m:r>
             </m:sub>
           </m:sSub>
@@ -12062,13 +12106,7 @@
                     <w:rPr>
                       <w:rFonts w:ascii="Cambria Math" w:hAnsi="Cambria Math"/>
                     </w:rPr>
-                    <m:t>s</m:t>
-                  </m:r>
-                  <m:r>
-                    <w:rPr>
-                      <w:rFonts w:ascii="Cambria Math" w:hAnsi="Cambria Math"/>
-                    </w:rPr>
-                    <m:t>0</m:t>
+                    <m:t>s0</m:t>
                   </m:r>
                 </m:sub>
               </m:sSub>
@@ -13222,13 +13260,7 @@
                     <w:rPr>
                       <w:rFonts w:ascii="Cambria Math" w:hAnsi="Cambria Math"/>
                     </w:rPr>
-                    <m:t>m</m:t>
-                  </m:r>
-                  <m:r>
-                    <w:rPr>
-                      <w:rFonts w:ascii="Cambria Math" w:hAnsi="Cambria Math"/>
-                    </w:rPr>
-                    <m:t>0</m:t>
+                    <m:t>m0</m:t>
                   </m:r>
                 </m:sub>
               </m:sSub>
@@ -13651,10 +13683,7 @@
         </m:r>
       </m:oMath>
       <w:r>
-        <w:t xml:space="preserve"> </w:t>
-      </w:r>
-      <w:r>
-        <w:t>is 0.620274, structure intercept is 0.163173 kg, and specific energy is 192.117 Wh/kg. Other nominal values appear in Table 2. These numerical precisions identify inputs, not measurement accuracy. The 1.5 m span proxy equals twice rotor diameter and repeats the 0.75 m rotor screen. The full input catalog supplies the simultaneous favorable and adverse parameter sets; those corners are not used for the primary 90-case counts.</w:t>
+        <w:t xml:space="preserve"> is 0.620274, structure intercept is 0.163173 kg, and specific energy is 192.117 Wh/kg. Other nominal values appear in Table 2. These numerical precisions identify inputs, not measurement accuracy. The 1.5 m span proxy equals twice rotor diameter and repeats the 0.75 m rotor screen. The full input catalog supplies the simultaneous favorable and adverse parameter sets; those corners are not used for the primary 90-case counts.</w:t>
       </w:r>
     </w:p>
     <w:p>
@@ -13662,7 +13691,7 @@
         <w:pStyle w:val="UnnumberedSection"/>
       </w:pPr>
       <w:bookmarkStart w:id="29" w:name="data-availability"/>
-      <w:bookmarkStart w:id="30" w:name="_Toc241065248"/>
+      <w:bookmarkStart w:id="30" w:name="_Toc241070104"/>
       <w:bookmarkEnd w:id="27"/>
       <w:r>
         <w:t>Data Availability</w:t>
@@ -13675,9 +13704,9 @@
         <w:jc w:val="both"/>
       </w:pPr>
       <w:r>
-        <w:t xml:space="preserve">The computational baseline, declared inputs, calibration data, 1,890 case records, tests, and independent checker are identified at </w:t>
-      </w:r>
-      <w:hyperlink r:id="rId13">
+        <w:t xml:space="preserve">The computational baseline, declared inputs, calibration data, 1,890 case records, tests, and independent checker are archived at </w:t>
+      </w:r>
+      <w:hyperlink r:id="rId14">
         <w:r>
           <w:rPr>
             <w:rStyle w:val="Hyperlink"/>
@@ -13686,7 +13715,16 @@
         </w:r>
       </w:hyperlink>
       <w:r>
-        <w:t xml:space="preserve"> (annotated tag aeroconf-2027-paper-2784-r2; computational baseline at commit 4f9e2cde8c429e6b241d4a09dc5f8e7dbb877069). The manuscript source is in the repository’s submission directory under a Creative Commons Attribution 4.0 license.</w:t>
+        <w:t xml:space="preserve"> under annotated tag </w:t>
+      </w:r>
+      <w:r>
+        <w:rPr>
+          <w:rStyle w:val="VerbatimChar"/>
+        </w:rPr>
+        <w:t>aeroconf-2027-paper-2784-r3</w:t>
+      </w:r>
+      <w:r>
+        <w:t>. The baseline commit is recorded in the repository README. The manuscript source is in the submission directory under a Creative Commons Attribution 4.0 license.</w:t>
       </w:r>
     </w:p>
     <w:p>
@@ -13694,7 +13732,7 @@
         <w:pStyle w:val="UnnumberedSection"/>
       </w:pPr>
       <w:bookmarkStart w:id="31" w:name="acknowledgements"/>
-      <w:bookmarkStart w:id="32" w:name="_Toc241065249"/>
+      <w:bookmarkStart w:id="32" w:name="_Toc241070105"/>
       <w:bookmarkEnd w:id="29"/>
       <w:r>
         <w:t>Acknowledgements</w:t>
@@ -13724,7 +13762,7 @@
         <w:pStyle w:val="UnnumberedSection"/>
       </w:pPr>
       <w:bookmarkStart w:id="33" w:name="references"/>
-      <w:bookmarkStart w:id="34" w:name="_Toc241065250"/>
+      <w:bookmarkStart w:id="34" w:name="_Toc241070106"/>
       <w:bookmarkEnd w:id="31"/>
       <w:r>
         <w:t>References</w:t>
@@ -13775,10 +13813,7 @@
         <w:jc w:val="both"/>
       </w:pPr>
       <w:r>
-        <w:t>[3] Y. Zeng, R. Zhang, and T. J. Lim,</w:t>
-      </w:r>
-      <w:r>
-        <w:t xml:space="preserve"> “Throughput maximization for UAV-enabled mobile relaying systems,” </w:t>
+        <w:t xml:space="preserve">[3] Y. Zeng, R. Zhang, and T. J. Lim, “Throughput maximization for UAV-enabled mobile relaying systems,” </w:t>
       </w:r>
       <w:r>
         <w:rPr>
@@ -13816,10 +13851,7 @@
         <w:jc w:val="both"/>
       </w:pPr>
       <w:r>
-        <w:t xml:space="preserve">[5] H. Yan, S.-H. Yang, Y. Chen, and S. A. Fahmy, </w:t>
-      </w:r>
-      <w:r>
-        <w:t xml:space="preserve">“Optimum battery weight for maximizing available energy in UAV-enabled wireless communications,” </w:t>
+        <w:t xml:space="preserve">[5] H. Yan, S.-H. Yang, Y. Chen, and S. A. Fahmy, “Optimum battery weight for maximizing available energy in UAV-enabled wireless communications,” </w:t>
       </w:r>
       <w:r>
         <w:rPr>
@@ -13857,11 +13889,7 @@
         <w:jc w:val="both"/>
       </w:pPr>
       <w:r>
-        <w:lastRenderedPageBreak/>
-        <w:t xml:space="preserve">[7] C. R. Russell, C. R. Theodore, and M. K. Sekula, </w:t>
-      </w:r>
-      <w:r>
-        <w:t xml:space="preserve">“Incorporating test data for small UAS at the conceptual design level,” in </w:t>
+        <w:t xml:space="preserve">[7] C. R. Russell, C. R. Theodore, and M. K. Sekula, “Incorporating test data for small UAS at the conceptual design level,” in </w:t>
       </w:r>
       <w:r>
         <w:rPr>
@@ -13873,7 +13901,7 @@
       <w:r>
         <w:t xml:space="preserve">, San Francisco, CA, USA, Jan. 2018. [Online]. Available: </w:t>
       </w:r>
-      <w:hyperlink r:id="rId14">
+      <w:hyperlink r:id="rId15">
         <w:r>
           <w:rPr>
             <w:rStyle w:val="Hyperlink"/>
@@ -13888,10 +13916,7 @@
         <w:jc w:val="both"/>
       </w:pPr>
       <w:r>
-        <w:t xml:space="preserve">[8] D. Bershadsky, S. Haviland, and E. N. Johnson, </w:t>
-      </w:r>
-      <w:r>
-        <w:t xml:space="preserve">“Electric multirotor UAV propulsion system sizing for performance prediction and design optimization,” in </w:t>
+        <w:t xml:space="preserve">[8] D. Bershadsky, S. Haviland, and E. N. Johnson, “Electric multirotor UAV propulsion system sizing for performance prediction and design optimization,” in </w:t>
       </w:r>
       <w:r>
         <w:rPr>
@@ -13910,9 +13935,36 @@
         <w:jc w:val="both"/>
       </w:pPr>
       <w:r>
-        <w:t xml:space="preserve">[9] C. Russell, G. Willink, C. Theodore, J. Jung, and B. Glasner, “Wind tunnel and hover performance test results for multicopter UAS vehicles,” NASA, Moffett Field, CA, USA, Rep. NASA/TM-2018-219758, Feb. 2018. [Online]. Available: </w:t>
-      </w:r>
-      <w:hyperlink r:id="rId15">
+        <w:t xml:space="preserve">[9] NASA, </w:t>
+      </w:r>
+      <w:r>
+        <w:rPr>
+          <w:i/>
+          <w:iCs/>
+        </w:rPr>
+        <w:t>NASA Systems Engineering Handbook</w:t>
+      </w:r>
+      <w:r>
+        <w:t xml:space="preserve">, NASA/SP-2016-6105 Rev. 2, 2016. [Online]. Available: </w:t>
+      </w:r>
+      <w:hyperlink r:id="rId16">
+        <w:r>
+          <w:rPr>
+            <w:rStyle w:val="Hyperlink"/>
+          </w:rPr>
+          <w:t>https://www.nasa.gov/wp-content/uploads/2018/09/nasa_systems_engineering_handbook_0.pdf</w:t>
+        </w:r>
+      </w:hyperlink>
+    </w:p>
+    <w:p>
+      <w:pPr>
+        <w:pStyle w:val="BodyText"/>
+        <w:jc w:val="both"/>
+      </w:pPr>
+      <w:r>
+        <w:t xml:space="preserve">[10] C. Russell, G. Willink, C. Theodore, J. Jung, and B. Glasner, “Wind tunnel and hover performance test results for multicopter UAS vehicles,” NASA, Moffett Field, CA, USA, Rep. NASA/TM-2018-219758, Feb. 2018. [Online]. Available: </w:t>
+      </w:r>
+      <w:hyperlink r:id="rId17">
         <w:r>
           <w:rPr>
             <w:rStyle w:val="Hyperlink"/>
@@ -13927,9 +13979,9 @@
         <w:jc w:val="both"/>
       </w:pPr>
       <w:r>
-        <w:t xml:space="preserve">[10] DJI, “Matrice 30 series specifications,” product page. Accessed: Sep. 11, 2026. [Online]. Available: </w:t>
-      </w:r>
-      <w:hyperlink r:id="rId16">
+        <w:t xml:space="preserve">[11] DJI, “Matrice 30 series specifications,” product page. Accessed: Sep. 11, 2026. [Online]. Available: </w:t>
+      </w:r>
+      <w:hyperlink r:id="rId18">
         <w:r>
           <w:rPr>
             <w:rStyle w:val="Hyperlink"/>
@@ -13944,12 +13996,9 @@
         <w:jc w:val="both"/>
       </w:pPr>
       <w:r>
-        <w:t xml:space="preserve">[11] Doodle Labs, “OEM Mesh Rider Radio: Hardware and RF specifications,” </w:t>
-      </w:r>
-      <w:r>
-        <w:t xml:space="preserve">product page. Accessed: Sep. 11, 2026. [Online]. Available: </w:t>
-      </w:r>
-      <w:hyperlink r:id="rId17">
+        <w:t xml:space="preserve">[12] Doodle Labs, “OEM Mesh Rider Radio: Hardware and RF specifications,” product page. Accessed: Sep. 11, 2026. [Online]. Available: </w:t>
+      </w:r>
+      <w:hyperlink r:id="rId19">
         <w:r>
           <w:rPr>
             <w:rStyle w:val="Hyperlink"/>
@@ -13964,7 +14013,7 @@
         <w:jc w:val="both"/>
       </w:pPr>
       <w:r>
-        <w:t xml:space="preserve">[12] </w:t>
+        <w:t xml:space="preserve">[13] </w:t>
       </w:r>
       <w:r>
         <w:rPr>
@@ -13976,7 +14025,7 @@
       <w:r>
         <w:t xml:space="preserve">, ITU-R Recommendation P.525-5, Nov. 2024. [Online]. Available: </w:t>
       </w:r>
-      <w:hyperlink r:id="rId18">
+      <w:hyperlink r:id="rId20">
         <w:r>
           <w:rPr>
             <w:rStyle w:val="Hyperlink"/>
@@ -13991,7 +14040,7 @@
         <w:jc w:val="both"/>
       </w:pPr>
       <w:r>
-        <w:t xml:space="preserve">[13] H. T. Friis, “A note on a simple transmission formula,” </w:t>
+        <w:t xml:space="preserve">[14] H. T. Friis, “A note on a simple transmission formula,” </w:t>
       </w:r>
       <w:r>
         <w:rPr>
@@ -14010,7 +14059,7 @@
         <w:jc w:val="both"/>
       </w:pPr>
       <w:r>
-        <w:t xml:space="preserve">[14] J. G. Leishman, </w:t>
+        <w:t xml:space="preserve">[15] J. G. Leishman, </w:t>
       </w:r>
       <w:r>
         <w:rPr>
@@ -14029,9 +14078,9 @@
         <w:jc w:val="both"/>
       </w:pPr>
       <w:r>
-        <w:t xml:space="preserve">[15] W. Johnson, “NDARC: NASA Design and Analysis of Rotorcraft, Theory, Appendix 3,” NASA, Moffett Field, CA, USA, Rep. NASA/TP-2009-215402, Release 1.7, Dec. 2012. [Online]. Available: </w:t>
-      </w:r>
-      <w:hyperlink r:id="rId19">
+        <w:t xml:space="preserve">[16] W. Johnson, “NDARC: NASA Design and Analysis of Rotorcraft, Theory, Appendix 3,” NASA, Moffett Field, CA, USA, Rep. NASA/TP-2009-215402, Release 1.7, Dec. 2012. [Online]. Available: </w:t>
+      </w:r>
+      <w:hyperlink r:id="rId21">
         <w:r>
           <w:rPr>
             <w:rStyle w:val="Hyperlink"/>
@@ -14046,9 +14095,9 @@
         <w:jc w:val="both"/>
       </w:pPr>
       <w:r>
-        <w:t xml:space="preserve">[16] DJI, “Matrice 4 series specifications,” product page. Accessed: Sep. 11, 2026. [Online]. Available: </w:t>
-      </w:r>
-      <w:hyperlink r:id="rId20">
+        <w:t xml:space="preserve">[17] DJI, “Matrice 4 series specifications,” product page. Accessed: Sep. 11, 2026. [Online]. Available: </w:t>
+      </w:r>
+      <w:hyperlink r:id="rId22">
         <w:r>
           <w:rPr>
             <w:rStyle w:val="Hyperlink"/>
@@ -14063,9 +14112,9 @@
         <w:jc w:val="both"/>
       </w:pPr>
       <w:r>
-        <w:t xml:space="preserve">[17] DJI, “Mavic 3M specifications,” product page. Accessed: Sep. 11, 2026. [Online]. Available: </w:t>
-      </w:r>
-      <w:hyperlink r:id="rId21">
+        <w:t xml:space="preserve">[18] DJI, “Mavic 3M specifications,” product page. Accessed: Sep. 11, 2026. [Online]. Available: </w:t>
+      </w:r>
+      <w:hyperlink r:id="rId23">
         <w:r>
           <w:rPr>
             <w:rStyle w:val="Hyperlink"/>
@@ -14080,10 +14129,7 @@
         <w:jc w:val="both"/>
       </w:pPr>
       <w:r>
-        <w:t xml:space="preserve">[18] C. Russell, J. Jung, G. Willink, and B. Glasner, “Wind tunnel and hover performance test results for multicopter </w:t>
-      </w:r>
-      <w:r>
-        <w:t xml:space="preserve">UAS vehicles,” in </w:t>
+        <w:t xml:space="preserve">[19] C. Russell, J. Jung, G. Willink, and B. Glasner, “Wind tunnel and hover performance test results for multicopter UAS vehicles,” in </w:t>
       </w:r>
       <w:r>
         <w:rPr>
@@ -14095,7 +14141,7 @@
       <w:r>
         <w:t xml:space="preserve">, West Palm Beach, FL, USA, May 2016. [Online]. Available: </w:t>
       </w:r>
-      <w:hyperlink r:id="rId22">
+      <w:hyperlink r:id="rId24">
         <w:r>
           <w:rPr>
             <w:rStyle w:val="Hyperlink"/>
@@ -14110,7 +14156,7 @@
         <w:jc w:val="both"/>
       </w:pPr>
       <w:r>
-        <w:t xml:space="preserve">[19] A. Al-Hourani, S. Kandeepan, and S. Lardner, “Optimal LAP altitude for maximum coverage,” </w:t>
+        <w:t xml:space="preserve">[20] A. Al-Hourani, S. Kandeepan, and S. Lardner, “Optimal LAP altitude for maximum coverage,” </w:t>
       </w:r>
       <w:r>
         <w:rPr>
@@ -14128,7 +14174,7 @@
         <w:pStyle w:val="UnnumberedSection"/>
       </w:pPr>
       <w:bookmarkStart w:id="35" w:name="biography"/>
-      <w:bookmarkStart w:id="36" w:name="_Toc241065251"/>
+      <w:bookmarkStart w:id="36" w:name="_Toc241070107"/>
       <w:bookmarkEnd w:id="33"/>
       <w:r>
         <w:t>Biography</w:t>
@@ -14145,10 +14191,10 @@
           <w:noProof/>
         </w:rPr>
         <w:drawing>
-          <wp:inline distT="0" distB="0" distL="0" distR="0" wp14:anchorId="4F3BD31B" wp14:editId="451E9CD5">
+          <wp:inline distT="0" distB="0" distL="0" distR="0" wp14:anchorId="21DA3CAA" wp14:editId="21DA3CAB">
             <wp:extent cx="1143000" cy="1372973"/>
             <wp:effectExtent l="0" t="0" r="0" b="0"/>
-            <wp:docPr id="6" name="Picture 6"/>
+            <wp:docPr id="7" name="Picture 7"/>
             <wp:cNvGraphicFramePr>
               <a:graphicFrameLocks xmlns:a="http://schemas.openxmlformats.org/drawingml/2006/main" noChangeAspect="1"/>
             </wp:cNvGraphicFramePr>
@@ -14160,7 +14206,7 @@
                     <pic:cNvPicPr/>
                   </pic:nvPicPr>
                   <pic:blipFill>
-                    <a:blip r:embed="rId23"/>
+                    <a:blip r:embed="rId25"/>
                     <a:stretch>
                       <a:fillRect/>
                     </a:stretch>
@@ -14306,7 +14352,7 @@
   <w:abstractNum w:abstractNumId="0" w15:restartNumberingAfterBreak="0">
     <w:nsid w:val="0000A990"/>
     <w:multiLevelType w:val="multilevel"/>
-    <w:tmpl w:val="1B422662"/>
+    <w:tmpl w:val="D5163B54"/>
     <w:lvl w:ilvl="0">
       <w:numFmt w:val="bullet"/>
       <w:lvlText w:val=" "/>
@@ -14380,7 +14426,7 @@
       </w:pPr>
     </w:lvl>
   </w:abstractNum>
-  <w:num w:numId="1" w16cid:durableId="392587543">
+  <w:num w:numId="1" w16cid:durableId="1205676921">
     <w:abstractNumId w:val="0"/>
   </w:num>
 </w:numbering>
@@ -15585,6 +15631,13 @@
       <w:sz w:val="22"/>
     </w:rPr>
   </w:style>
+  <w:style w:type="paragraph" w:customStyle="1" w:styleId="TOC11">
+    <w:name w:val="TOC 11"/>
+    <w:rPr>
+      <w:color w:val="000000"/>
+      <w:sz w:val="20"/>
+    </w:rPr>
+  </w:style>
   <w:style w:type="paragraph" w:customStyle="1" w:styleId="UnnumberedSection">
     <w:name w:val="Unnumbered Section"/>
     <w:basedOn w:val="Normal"/>
@@ -15604,7 +15657,7 @@
     <w:next w:val="Normal"/>
     <w:autoRedefine/>
     <w:uiPriority w:val="39"/>
-    <w:rsid w:val="006D7B38"/>
+    <w:rsid w:val="00E932C9"/>
     <w:pPr>
       <w:spacing w:after="100"/>
     </w:pPr>

</xml_diff>